<commit_message>
Explain autonomous navigation systems and include complete thesis outline
</commit_message>
<xml_diff>
--- a/research/drafts/chapter-1.docx
+++ b/research/drafts/chapter-1.docx
@@ -2,7 +2,7 @@
 <file path=word/document.xml><?xml version="1.0" encoding="utf-8"?>
 <w:document xmlns:w="http://schemas.openxmlformats.org/wordprocessingml/2006/main" xmlns:m="http://schemas.openxmlformats.org/officeDocument/2006/math" xmlns:r="http://schemas.openxmlformats.org/officeDocument/2006/relationships" xmlns:o="urn:schemas-microsoft-com:office:office" xmlns:v="urn:schemas-microsoft-com:vml" xmlns:w10="urn:schemas-microsoft-com:office:word" xmlns:a="http://schemas.openxmlformats.org/drawingml/2006/main" xmlns:pic="http://schemas.openxmlformats.org/drawingml/2006/picture" xmlns:wp="http://schemas.openxmlformats.org/drawingml/2006/wordprocessingDrawing">
   <w:body>
-    <w:bookmarkStart w:id="24" w:name="X381a4be41f3d8a6f408f003d821cb6cd7048639"/>
+    <w:bookmarkStart w:id="25" w:name="X32bd3c32c28b10d1426470eb95294bd15528921"/>
     <w:p>
       <w:pPr>
         <w:pStyle w:val="Heading1"/>
@@ -14,10 +14,10 @@
           <w:color w:val="000000"/>
           <w:sz w:val="28"/>
         </w:rPr>
-        <w:t>1 ТЕОРЕТИЧЕСКИЕ И НОРМАТИВНЫЕ ОСНОВЫ АВТОНОМНОГО СУДОВОЖДЕНИЯ ПРИ ПЛАВАНИИ В УЗКОСТЯХ</w:t>
+        <w:t>1 ТЕОРЕТИЧЕСКИЕ ОСНОВЫ АВТОНОМНОГО СУДОВОЖДЕНИЯ И ПРОБЛЕМЫ ЕГО ПРИМЕНЕНИЯ В УЗКОСТЯХ</w:t>
       </w:r>
     </w:p>
-    <w:bookmarkStart w:id="20" w:name="Xdad6f52ab5828a7ff9addc932cc1a3c09c46013"/>
+    <w:bookmarkStart w:id="20" w:name="X5742fa8b645e15511acd7bdaedef35a072275e2"/>
     <w:p>
       <w:pPr>
         <w:pStyle w:val="Heading2"/>
@@ -28,7 +28,7 @@
           <w:color w:val="000000"/>
           <w:sz w:val="28"/>
         </w:rPr>
-        <w:t xml:space="preserve">1.1 Понятия, режимы управления и участие человека</w:t>
+        <w:t xml:space="preserve">1.1 Основные понятия и режимы автономного судовождения</w:t>
       </w:r>
     </w:p>
     <w:p>
@@ -104,7 +104,7 @@
     </w:p>
     <w:tbl>
       <w:tblPr>
-        <w:tblStyle w:val="Table"/>
+        <w:tblStyle w:val="TableGrid"/>
         <w:tblW w:type="pct" w:w="5000"/>
         <w:jc w:val="left"/>
         <w:tblLayout w:type="fixed"/>
@@ -117,8 +117,8 @@
       </w:tblGrid>
       <w:tr>
         <w:trPr>
-          <w:tblHeader w:val="on"/>
           <w:tblHeader w:val="true"/>
+          <w:cantSplit/>
         </w:trPr>
         <w:tc>
           <w:tcPr>
@@ -126,7 +126,7 @@
           </w:tcPr>
           <w:p>
             <w:pPr>
-              <w:pStyle w:val="Compact"/>
+              <w:keepNext/>
               <w:spacing w:line="240" w:lineRule="auto" w:before="0" w:after="0"/>
               <w:ind w:firstLine="0"/>
               <w:jc w:val="left"/>
@@ -147,7 +147,7 @@
           </w:tcPr>
           <w:p>
             <w:pPr>
-              <w:pStyle w:val="Compact"/>
+              <w:keepNext/>
               <w:spacing w:line="240" w:lineRule="auto" w:before="0" w:after="0"/>
               <w:ind w:firstLine="0"/>
               <w:jc w:val="left"/>
@@ -168,7 +168,7 @@
           </w:tcPr>
           <w:p>
             <w:pPr>
-              <w:pStyle w:val="Compact"/>
+              <w:keepNext/>
               <w:spacing w:line="240" w:lineRule="auto" w:before="0" w:after="0"/>
               <w:ind w:firstLine="0"/>
               <w:jc w:val="left"/>
@@ -185,13 +185,16 @@
         </w:tc>
       </w:tr>
       <w:tr>
+        <w:trPr>
+          <w:cantSplit/>
+        </w:trPr>
         <w:tc>
           <w:tcPr>
             <w:tcW w:type="dxa" w:w="1304"/>
           </w:tcPr>
           <w:p>
             <w:pPr>
-              <w:pStyle w:val="Compact"/>
+              <w:keepNext/>
               <w:spacing w:line="240" w:lineRule="auto" w:before="0" w:after="0"/>
               <w:ind w:firstLine="0"/>
               <w:jc w:val="left"/>
@@ -212,7 +215,7 @@
           </w:tcPr>
           <w:p>
             <w:pPr>
-              <w:pStyle w:val="Compact"/>
+              <w:keepNext/>
               <w:spacing w:line="240" w:lineRule="auto" w:before="0" w:after="0"/>
               <w:ind w:firstLine="0"/>
               <w:jc w:val="left"/>
@@ -233,7 +236,7 @@
           </w:tcPr>
           <w:p>
             <w:pPr>
-              <w:pStyle w:val="Compact"/>
+              <w:keepNext/>
               <w:spacing w:line="240" w:lineRule="auto" w:before="0" w:after="0"/>
               <w:ind w:firstLine="0"/>
               <w:jc w:val="left"/>
@@ -250,13 +253,16 @@
         </w:tc>
       </w:tr>
       <w:tr>
+        <w:trPr>
+          <w:cantSplit/>
+        </w:trPr>
         <w:tc>
           <w:tcPr>
             <w:tcW w:type="dxa" w:w="1304"/>
           </w:tcPr>
           <w:p>
             <w:pPr>
-              <w:pStyle w:val="Compact"/>
+              <w:keepNext/>
               <w:spacing w:line="240" w:lineRule="auto" w:before="0" w:after="0"/>
               <w:ind w:firstLine="0"/>
               <w:jc w:val="left"/>
@@ -277,7 +283,7 @@
           </w:tcPr>
           <w:p>
             <w:pPr>
-              <w:pStyle w:val="Compact"/>
+              <w:keepNext/>
               <w:spacing w:line="240" w:lineRule="auto" w:before="0" w:after="0"/>
               <w:ind w:firstLine="0"/>
               <w:jc w:val="left"/>
@@ -298,7 +304,7 @@
           </w:tcPr>
           <w:p>
             <w:pPr>
-              <w:pStyle w:val="Compact"/>
+              <w:keepNext/>
               <w:spacing w:line="240" w:lineRule="auto" w:before="0" w:after="0"/>
               <w:ind w:firstLine="0"/>
               <w:jc w:val="left"/>
@@ -315,13 +321,16 @@
         </w:tc>
       </w:tr>
       <w:tr>
+        <w:trPr>
+          <w:cantSplit/>
+        </w:trPr>
         <w:tc>
           <w:tcPr>
             <w:tcW w:type="dxa" w:w="1304"/>
           </w:tcPr>
           <w:p>
             <w:pPr>
-              <w:pStyle w:val="Compact"/>
+              <w:keepNext/>
               <w:spacing w:line="240" w:lineRule="auto" w:before="0" w:after="0"/>
               <w:ind w:firstLine="0"/>
               <w:jc w:val="left"/>
@@ -342,7 +351,7 @@
           </w:tcPr>
           <w:p>
             <w:pPr>
-              <w:pStyle w:val="Compact"/>
+              <w:keepNext/>
               <w:spacing w:line="240" w:lineRule="auto" w:before="0" w:after="0"/>
               <w:ind w:firstLine="0"/>
               <w:jc w:val="left"/>
@@ -363,7 +372,7 @@
           </w:tcPr>
           <w:p>
             <w:pPr>
-              <w:pStyle w:val="Compact"/>
+              <w:keepNext/>
               <w:spacing w:line="240" w:lineRule="auto" w:before="0" w:after="0"/>
               <w:ind w:firstLine="0"/>
               <w:jc w:val="left"/>
@@ -380,13 +389,16 @@
         </w:tc>
       </w:tr>
       <w:tr>
+        <w:trPr>
+          <w:cantSplit/>
+        </w:trPr>
         <w:tc>
           <w:tcPr>
             <w:tcW w:type="dxa" w:w="1304"/>
           </w:tcPr>
           <w:p>
             <w:pPr>
-              <w:pStyle w:val="Compact"/>
+              <w:keepNext w:val="0"/>
               <w:spacing w:line="240" w:lineRule="auto" w:before="0" w:after="0"/>
               <w:ind w:firstLine="0"/>
               <w:jc w:val="left"/>
@@ -407,7 +419,7 @@
           </w:tcPr>
           <w:p>
             <w:pPr>
-              <w:pStyle w:val="Compact"/>
+              <w:keepNext w:val="0"/>
               <w:spacing w:line="240" w:lineRule="auto" w:before="0" w:after="0"/>
               <w:ind w:firstLine="0"/>
               <w:jc w:val="left"/>
@@ -428,7 +440,7 @@
           </w:tcPr>
           <w:p>
             <w:pPr>
-              <w:pStyle w:val="Compact"/>
+              <w:keepNext w:val="0"/>
               <w:spacing w:line="240" w:lineRule="auto" w:before="0" w:after="0"/>
               <w:ind w:firstLine="0"/>
               <w:jc w:val="left"/>
@@ -501,7 +513,7 @@
       </w:r>
     </w:p>
     <w:bookmarkEnd w:id="20"/>
-    <w:bookmarkStart w:id="21" w:name="основные-элементы-технической-системы"/>
+    <w:bookmarkStart w:id="21" w:name="X911f6ae2ed747da53fae72a96f203123f2cf49c"/>
     <w:p>
       <w:pPr>
         <w:pStyle w:val="Heading2"/>
@@ -512,7 +524,7 @@
           <w:color w:val="000000"/>
           <w:sz w:val="28"/>
         </w:rPr>
-        <w:t xml:space="preserve">1.2 Основные элементы технической системы</w:t>
+        <w:t xml:space="preserve">1.2 Понятие узкости и связанные навигационные понятия</w:t>
       </w:r>
     </w:p>
     <w:p>
@@ -523,7 +535,7 @@
         <w:rPr>
           <w:b w:val="0"/>
         </w:rPr>
-        <w:t xml:space="preserve">Навигационные функции MASS целесообразно рассматривать как последовательность получения данных, оценки ситуации, выбора действия, его исполнения и контроля результата. В настоящей работе эта последовательность используется как схема анализа технических решений. Она согласуется с выделенными в Кодексе подфункциями навигации: планированием рейса, поддержанием ситуационной осведомлённости, предотвращением столкновений и посадки на мель, выполнением маршрута и наблюдением за его выполнением [1, с. 39–41]. Схема не задаёт единственную аппаратную архитектуру судна; состав оборудования и распределение задач необходимо устанавливать по документации конкретного проекта.</w:t>
+        <w:t xml:space="preserve">В настоящей работе узкостью называется участок плавания, на котором доступное для судна пространство ограничивает выбор пути и манёвра. Это рабочее определение задаёт предмет технического анализа: система должна вести судно в допустимых границах и учитывать, какое пространство остаётся для расхождения, поворота или изменения скорости. При оценке участка ширину водной поверхности необходимо сопоставлять с глубинами, осадкой, размерами и маневренными характеристиками судна. Руководство ММО по планированию рейса предусматривает учёт этих характеристик, минимального запаса воды под килем, просадки, крена на повороте и течений [5, п. 2.1, 3.2.2.1–3.2.2.5].</w:t>
       </w:r>
     </w:p>
     <w:p>
@@ -534,7 +546,7 @@
         <w:rPr>
           <w:b w:val="0"/>
         </w:rPr>
-        <w:t xml:space="preserve">Конкретный пример распределения этих задач представлен в учебном описании комплекса «БЭС-КФ». В нём автономная навигационная система включает обработку поступающих сведений, прогнозирование обстановки и подготовку манёвра; отдельно выделены оптическое наблюдение, управление движением, контроль технических средств и дистанционный пульт. Некоторые элементы предусмотрены как опциональные при наличии на судне равнозначных средств [11, с. 11–13]. Такая организация показывает, что оценка ситуации и выполнение управляющей команды могут относиться к разным подсистемам. При использовании этого примера следует учитывать его происхождение: учебный материал объясняет структуру конкретного комплекса, а фактическая комплектация рассматриваемого судна устанавливается по его документации.</w:t>
+        <w:t xml:space="preserve">Термины «узкость», «узкий проход» и «фарватер» требуют разграничения между навигационным описанием участка и применением правового требования. Правило 9 Международных правил предупреждения столкновений судов в море 1972 года (МППСС-72) относится к движению в узком проходе или фарватере. Оно предусматривает движение ближе к внешней границе, находящейся с правого борта, насколько это безопасно и практически возможно, и учитывает суда, которые могут безопасно следовать только в пределах этого прохода или фарватера [18, правило 9(a)–(d), международная редакция]. Поэтому отнесение ситуации к правилу влияет на взаимодействие судов; его нельзя подменять произвольно выбранной в исследовании шириной участка.</w:t>
       </w:r>
     </w:p>
     <w:p>
@@ -545,7 +557,7 @@
         <w:rPr>
           <w:b w:val="0"/>
         </w:rPr>
-        <w:t xml:space="preserve">Первое звено связано с получением сведений о собственном судне, окружающем движении и районе плавания. Для оценки навигационной ситуации нужны данные о положении и движении судна, обнаруженных объектах, гидрографических условиях и ограничениях маршрута. Кодекс предусматривает доступность необходимых навигационных данных, их представление в машиночитаемом виде для автономной системы и непрерывное наблюдение за информацией, требуемой для безопасного плавания [1, с. 39–40]. При последующем изучении российских и японских проектов необходимо установить, какие данные фактически получает система и как они поступают к человеку, участвующему в управлении.</w:t>
+        <w:t xml:space="preserve">Названия «канал» и «пролив» также не заменяют описание условий судовождения. Для задачи управления необходимо установить конкретную конфигурацию пути, границы безопасных глубин, участки поворота, возможные направления движения других судов и действующие правила. В этой работе название района служит исходной характеристикой, а пригодность автономной функции оценивается по установленным навигационным ограничениям. Такой подход согласуется с требованием планировать весь переход, включая участки лоцманской проводки, и определять опасные места по доступной актуальной информации [5, п. 2.1, 3.1].</w:t>
       </w:r>
     </w:p>
     <w:p>
@@ -556,7 +568,7 @@
         <w:rPr>
           <w:b w:val="0"/>
         </w:rPr>
-        <w:t xml:space="preserve">В учебном разделе о технических средствах среди источников навигационных данных названы радиолокационная станция (РЛС), автоматическая идентификационная система (АИС), гирокомпас, лаг, эхолот и средства наблюдения за состоянием судна. Дополнительно рассматриваются глобальная навигационная спутниковая система (ГНСС), инерциальные и оптические средства [12, с. 3–4]. Для анализа узкости этот перечень целесообразно распределить по решаемым задачам: определение места собственного судна, оценка его движения, наблюдение внешних объектов и контроль доступных средств управления. Обоснование состава оборудования должно связывать эти задачи с условиями плавания. Перечень приборов сам по себе не устанавливает точность оценки опасности и своевременность реакции системы.</w:t>
+        <w:t xml:space="preserve">Отдельно следует различать экранирование цели препятствием и ограниченную видимость. При подходе к изгибу другое судно может быть закрыто берегом или сооружением; правило 9(f) предусматривает для таких участков особую осторожность и соответствующий звуковой сигнал. Ограниченная видимость определяется правилом 3(l) через такие условия, как туман, мгла, снегопад, сильный дождь и аналогичные причины [18, правила 3(l), 9(f), международная редакция]. Для автономной системы эти случаи задают разные условия наблюдения: в одном случае необходимо учитывать геометрически закрытый сектор, в другом — возможности средств наблюдения при ухудшении видимости.</w:t>
       </w:r>
     </w:p>
     <w:p>
@@ -567,132 +579,11 @@
         <w:rPr>
           <w:b w:val="0"/>
         </w:rPr>
-        <w:t xml:space="preserve">Следующее звено — проверка и объединение поступающих сведений. Данные должны позволять судить об одной и той же обстановке, хотя они могут относиться к разным моментам времени или иметь разные ограничения достоверности. Для целей анализа в этом звене следует рассматривать актуальность информации, противоречия между наблюдениями и признаки отказа источника. Основанием служат положения Кодекса о точности, целостности и качестве данных, а также о непрерывном анализе ситуации [1, с. 24, 40]. Сам факт поступления нескольких сообщений не подтверждает, что их совместное использование даёт правильную оценку опасности.</w:t>
-      </w:r>
-    </w:p>
-    <w:p>
-      <w:pPr>
-        <w:pStyle w:val="BodyText"/>
-      </w:pPr>
-      <w:r>
-        <w:rPr>
-          <w:b w:val="0"/>
-        </w:rPr>
-        <w:t xml:space="preserve">Описание информационных потоков «БЭС-КФ» позволяет различить данные для автоматической обработки и сведения, представляемые человеку. Оптическая подсистема передаёт информацию об обнаруженных объектах в машиночитаемом виде в навигационную систему, а обработанное видеоизображение — на средства отображения на мостике и дистанционном пульте. Также описано использование сведений оптического наблюдения, АИС и РЛС для анализа работы системы [13, с. 39–40]. Поэтому при сравнении проектов необходимо установить, как наблюдения связываются с одной целью и как учитывается их несогласованность. Передача изображения оператору и формирование данных для алгоритма являются различными задачами, которые требуют собственной проверки.</w:t>
-      </w:r>
-    </w:p>
-    <w:p>
-      <w:pPr>
-        <w:pStyle w:val="BodyText"/>
-      </w:pPr>
-      <w:r>
-        <w:rPr>
-          <w:b w:val="0"/>
-        </w:rPr>
-        <w:t xml:space="preserve">Обнаружение объекта представляет собой часть более широкой задачи понимания обстановки. В определении ситуационной осведомлённости Кодекс объединяет восприятие окружающей среды и состояния значимых систем, понимание смысла полученных сведений и прогнозирование будущего состояния. Для навигационной системы предусмотрен непрерывный анализ текущей ситуации с учётом её возможностей и режима работы [1, с. 10, 40]. В узкости это позволяет поставить три разных вопроса: обнаружен ли объект, какое значение он имеет для движения судна и какую опасность может представлять при дальнейшем сближении.</w:t>
-      </w:r>
-    </w:p>
-    <w:p>
-      <w:pPr>
-        <w:pStyle w:val="BodyText"/>
-      </w:pPr>
-      <w:r>
-        <w:rPr>
-          <w:b w:val="0"/>
-        </w:rPr>
-        <w:t xml:space="preserve">Различие между обнаружением и пониманием можно пояснить условной ситуацией. Система получила сведения о встречном судне на ограниченном участке пути. Для выбора действия недостаточно только отметить наличие цели: необходимо связать её движение с положением собственного судна, доступным пространством и возможными последствиями манёвра. Этот пример не является результатом испытания или модельного расчёта. Он показывает, какие исходные сведения и решения следует искать в материалах проектов при анализе способности системы поддерживать ситуационную осведомлённость.</w:t>
-      </w:r>
-    </w:p>
-    <w:p>
-      <w:pPr>
-        <w:pStyle w:val="BodyText"/>
-      </w:pPr>
-      <w:r>
-        <w:rPr>
-          <w:b w:val="0"/>
-        </w:rPr>
-        <w:t xml:space="preserve">Планирование имеет два взаимосвязанных уровня: подготовку рейсового маршрута и выбор действий в изменяющейся обстановке. Кодекс предусматривает проверку безопасности плана, возможность его пересмотра и участие капитана в утверждении плана и изменений. При предотвращении столкновения, навала или посадки на мель решения об изменении курса либо скорости должны быть своевременными и учитывать безопасные эксплуатационные пределы. Требования главы о безопасности навигации связаны также с Международными правилами предупреждения столкновений судов в море 1972 года (МППСС-72) [1, с. 38–40]. Следовательно, при изучении алгоритма необходимо проверять как основание для выбранного манёвра, так и его соответствие применимым ограничениям.</w:t>
-      </w:r>
-    </w:p>
-    <w:p>
-      <w:pPr>
-        <w:pStyle w:val="BodyText"/>
-      </w:pPr>
-      <w:r>
-        <w:rPr>
-          <w:b w:val="0"/>
-        </w:rPr>
-        <w:t xml:space="preserve">В учебном изложении управления по маршруту выбор пути отделён от его исполнения: маршрут задаётся заранее, а система использует данные о месте, курсе и скорости для проводки судна. Там же различаются удержание линии маршрута и движение к очередной путевой точке при допустимом отклонении от линии [14, с. 58–59]. Для темы исследования это даёт основание отдельно проверять точность следования заданному пути и способность изменить движение при появлении опасности. Успешное выполнение заранее подготовленного маршрута ещё не показывает, что система самостоятельно обнаружила препятствие, оценила последствия манёвра и выбрала допустимое решение в узкости.</w:t>
-      </w:r>
-    </w:p>
-    <w:p>
-      <w:pPr>
-        <w:pStyle w:val="BodyText"/>
-      </w:pPr>
-      <w:r>
-        <w:rPr>
-          <w:b w:val="0"/>
-        </w:rPr>
-        <w:t xml:space="preserve">Выбранное действие должно быть передано средствам управления движением и проверено по фактическому результату. В функциональной схеме это отдельные задачи: формирование управляющего воздействия и наблюдение за изменением положения и движения судна. Кодекс предусматривает исполнение маршрута в установленных пределах допустимого отклонения, непрерывное наблюдение за ходом рейса и предупреждение капитана при обстоятельствах, требующих отклонения от плана. Согласование автономной навигационной системы с другими судовыми системами должно предотвращать противоречащие друг другу команды [1, с. 39, 41]. При сравнении проектов поэтому необходимо различать расчёт манёвра, его исполнение и контроль того, что требуемый результат достигнут.</w:t>
-      </w:r>
-    </w:p>
-    <w:p>
-      <w:pPr>
-        <w:pStyle w:val="BodyText"/>
-      </w:pPr>
-      <w:r>
-        <w:rPr>
-          <w:b w:val="0"/>
-        </w:rPr>
-        <w:t xml:space="preserve">Связь с дистанционным оператором образует ещё одно звено системы. Для дистанционного наблюдения или управления важны пропускная способность канала, целостность данных, надёжность и задержка передачи. Кодекс предусматривает определение требований к связи для разных этапов рейса и режимов работы, контроль её качества, резервирование по результатам оценки риска и порядок действий при ухудшении либо потере связи [1, с. 41–42]. Универсальную допустимую задержку нельзя назначать в работе без исходных данных. Её значение следует обосновывать для конкретного режима и задачи, включая передачу человеку информации, необходимой для принятия управления.</w:t>
-      </w:r>
-    </w:p>
-    <w:p>
-      <w:pPr>
-        <w:pStyle w:val="BodyText"/>
-      </w:pPr>
-      <w:r>
-        <w:rPr>
-          <w:b w:val="0"/>
-        </w:rPr>
-        <w:t xml:space="preserve">Передача управления требует определённого порядка изменения полномочий. В учебном описании «БЭС-КФ» приведён пример переключателя на мостике, позволяющего физически отключить автономную навигационную систему от исполнительных устройств при переходе к ручному режиму [15, с. 9]. Этот пример относится к конкретной организации управления на судне с экипажем. При рассмотрении каждого проекта необходимо выяснять, кто инициирует переход, как подтверждается принятие управления и какие данные доступны принимающему его человеку. Возможность переключения должна оцениваться вместе с состоянием судна и обстановкой в момент перехода; наличие органа переключения не определяет само по себе безопасность процедуры.</w:t>
-      </w:r>
-    </w:p>
-    <w:p>
-      <w:pPr>
-        <w:pStyle w:val="BodyText"/>
-      </w:pPr>
-      <w:r>
-        <w:rPr>
-          <w:b w:val="0"/>
-        </w:rPr>
-        <w:t xml:space="preserve">Отказы и выход за допустимые условия должны рассматриваться вместе с нормальной работой. Кодекс различает ухудшение состояния отдельной функции и выход судна в целом за его эксплуатационные границы. При таком выходе предусматривается заранее определённое резервное состояние — fallback state — и действия для безопасного перехода в него и восстановления работы. Эти действия должны быть проверяемыми и оценёнными с точки зрения риска; они не должны приводить к неприемлемой опасности для людей, других судов, инфраструктуры и морской среды [1, с. 21]. Поэтому остановку или удержание положения нельзя заранее объявить пригодной реакцией для любой узкости. В рамках исследования нужно проверить, какие последствия предполагаемое резервное действие имеет в рассматриваемой ситуации.</w:t>
-      </w:r>
-    </w:p>
-    <w:p>
-      <w:pPr>
-        <w:pStyle w:val="BodyText"/>
-      </w:pPr>
-      <w:r>
-        <w:rPr>
-          <w:b w:val="0"/>
-        </w:rPr>
-        <w:t xml:space="preserve">Контроль достоверности данных связан и с кибербезопасностью. В учебном материале среди признаков нарушения работы перечислены неполный анализ поступающих сведений, прерывание связи и несоответствие модели окружающей обстановки действительности [16, с. 23–24]. Для исследования эти признаки задают вопросы к диагностике: как система обнаруживает несогласованность и какие функции остаются доступными после неё? Указанный симптом сам по себе не доказывает кибератаку, поскольку необходимо установить причину нарушения. Поэтому в сценарном анализе следует отдельно задавать наблюдаемое ухудшение данных, возможную причину и предусмотренное действие, не приписывая системе подтверждённых возможностей защиты без соответствующих документов.</w:t>
-      </w:r>
-    </w:p>
-    <w:p>
-      <w:pPr>
-        <w:pStyle w:val="BodyText"/>
-      </w:pPr>
-      <w:r>
-        <w:rPr>
-          <w:b w:val="0"/>
-        </w:rPr>
-        <w:t xml:space="preserve">Завершающий элемент связан с регистрацией данных и возможностью объяснить ход работы системы. Кодекс предусматривает ведение записей, позволяющих восстановить операции MASS, включая дистанционное управление и автоматизированное принятие решений. Для технических систем также предусмотрены испытания и валидация, включающие моделирование, проверку компонентов, интеграционные и системные испытания [1, с. 24]. Эти положения определяют вопросы к доказательствам работоспособности проекта: какие входные данные были получены, какое решение принято, как оно исполнено и чем подтверждён результат. В последующих разделах такая проверка позволит отделять описание функций от сведений об их испытаниях и применимости в узкостях.</w:t>
+        <w:t xml:space="preserve">Таким образом, при дальнейшем сравнении проектов узкость описывается набором условий: доступное пространство, глубины, конфигурация пути, движение участников, условия наблюдения и применимые правила. Это позволяет поставить проверяемый вопрос о каждой функции системы. Например, требуется установить, обнаруживает ли она цель после выхода из закрытого сектора и остаётся ли рассчитанный манёвр внутри безопасного пространства, а не ограничиваться указанием на наличие автоматического управления.</w:t>
       </w:r>
     </w:p>
     <w:bookmarkEnd w:id="21"/>
-    <w:bookmarkStart w:id="22" w:name="особенности-плавания-в-узкостях"/>
+    <w:bookmarkStart w:id="22" w:name="X0bc034fe7d3fd068c9294d20e2ed5a346f4d785"/>
     <w:p>
       <w:pPr>
         <w:pStyle w:val="Heading2"/>
@@ -703,7 +594,7 @@
           <w:color w:val="000000"/>
           <w:sz w:val="28"/>
         </w:rPr>
-        <w:t xml:space="preserve">1.3 Особенности плавания в узкостях</w:t>
+        <w:t xml:space="preserve">1.3 Технические средства и принципы работы автономной системы судовождения</w:t>
       </w:r>
     </w:p>
     <w:p>
@@ -714,12 +605,699 @@
         <w:rPr>
           <w:b w:val="0"/>
         </w:rPr>
-        <w:t xml:space="preserve">В настоящем исследовании узкости рассматриваются как участки плавания, где доступное пространство и условия движения ограничивают выбор пути и манёвра. Такая рабочая характеристика нужна для анализа технических функций; она не устанавливает юридическую границу действия правил. Для конкретного участка необходимо отдельно выяснять применимость требований к узкому проходу или фарватеру, наличие системы разделения движения и местных правил. Например, правило 9 МППСС-72 относится к узким проходам и фарватерам, а правило 10 — к принятым ММО системам разделения движения [4].</w:t>
+        <w:t xml:space="preserve">Автономная система судовождения объединяет средства наблюдения, вычислительные модули и устройства управления движением. Между ними передаются разные данные: измеренные координаты, сведения о целях, ограничения маршрута, заданные курс и скорость, команды исполнительным механизмам. При замкнутом управлении результат действия вновь измеряется и используется для следующей команды. Такая обратная связь позволяет корректировать движение по фактическому состоянию судна [15, с. 5–6]. Функциональная последовательность включает определение собственного состояния, наблюдение за объектами, согласование данных, оценку опасности, построение движения и его исполнение. Состав оборудования и распределение вычислений зависят от проекта.</w:t>
       </w:r>
     </w:p>
     <w:p>
       <w:pPr>
         <w:pStyle w:val="BodyText"/>
+      </w:pPr>
+      <w:r>
+        <w:rPr>
+          <w:b w:val="0"/>
+        </w:rPr>
+        <w:t xml:space="preserve">Такое разделение согласуется с обзором архитектуры автономной навигации, опубликованным в 2025 году. Авторы связывают ситуационную осведомлённость и объединение данных датчиков с предотвращением столкновений, а принятые решения — с управлением движением и исполнительными механизмами [19, разд. 3.1, 3.4]. Обзор служит основанием для описания функциональных связей; фактическая точность и надёжность конкретного комплекса устанавливаются по его испытаниям.</w:t>
+      </w:r>
+    </w:p>
+    <w:p>
+      <w:pPr>
+        <w:pStyle w:val="BodyText"/>
+      </w:pPr>
+      <w:r>
+        <w:rPr>
+          <w:b w:val="0"/>
+        </w:rPr>
+        <w:t xml:space="preserve">Первый набор данных описывает собственное судно. Приёмник глобальной навигационной спутниковой системы (ГНСС) предоставляет навигационное решение о его положении и движении; гирокомпас — курс; лаг — скорость в соответствии с используемым принципом измерения; датчик угловой скорости — быстроту поворота. Эхолот даёт сведения о глубине под преобразователем, а датчики рулевой и энергетической установок показывают фактическое положение органов управления и состояние механизмов. В техническом составе, рассмотренном в учебном курсе, дополнительно предусмотрены инерциальная навигация, средства измерения ветра, качки и видимости [12, с. 3–4]. Для расчёта манёвра эти величины имеют разное назначение: координаты показывают, где находится судно, курс — куда направлена его диаметральная плоскость, скорость и угловая скорость — как оно движется в данный момент.</w:t>
+      </w:r>
+    </w:p>
+    <w:p>
+      <w:pPr>
+        <w:pStyle w:val="BodyText"/>
+      </w:pPr>
+      <w:r>
+        <w:rPr>
+          <w:b w:val="0"/>
+        </w:rPr>
+        <w:t xml:space="preserve">Второй набор данных относится к окружающим объектам. Радиолокационная станция (РЛС) и средства сопровождения целей дают наблюдения об обнаруженных объектах и их движении. Автоматическая идентификационная система (АИС) служит источником передаваемых участниками данных; её сообщения необходимо сопоставлять с другими наблюдениями. Оптические средства анализируют изображения видимого и инфракрасного диапазонов. В отдельных комплектациях предусматриваются лазерные дальномеры, лидары и средства приёма внешних звуковых сигналов [12, с. 3–4; 13, с. 39]. Различные каналы позволяют исследовать один объект с разных сторон: получить его положение относительно судна, признаки внешнего вида и доступные идентификационные сведения. Наличие одного канала не подтверждает полноту наблюдения всей акватории.</w:t>
+      </w:r>
+    </w:p>
+    <w:p>
+      <w:pPr>
+        <w:pStyle w:val="BodyText"/>
+      </w:pPr>
+      <w:r>
+        <w:rPr>
+          <w:b w:val="0"/>
+        </w:rPr>
+        <w:t xml:space="preserve">Работу оптической подсистемы можно проследить по конкретной последовательности обработки. В описанном учебном примере кадры нескольких камер собираются с общей временной привязкой, корректируются и объединяются в панорамное изображение. Затем программа выделяет объекты, определяет доступные признаки и связывает наблюдения на последовательных кадрах. Результатом становится формуляр цели: её идентификатор, тип и оценённые параметры. При достаточной продолжительности наблюдения определяются характеристики движения. На экран оператора передаётся изображение с обозначениями объектов, а в навигационную систему — формуляры в согласованном формате [13, с. 39–40]. Таким образом, видеопоток для человека и данные для расчёта манёвра являются разными выходами одной подсистемы.</w:t>
+      </w:r>
+    </w:p>
+    <w:p>
+      <w:pPr>
+        <w:pStyle w:val="BodyText"/>
+      </w:pPr>
+      <w:r>
+        <w:rPr>
+          <w:b w:val="0"/>
+        </w:rPr>
+        <w:t xml:space="preserve">Согласование наблюдений требуется потому, что одна цель может присутствовать сразу в нескольких источниках. Если объект обнаружен камерой и РЛС и одновременно передаёт данные АИС, вычислительная система должна установить, относятся ли эти записи к одному судну. В учебном описании предусмотрено сопоставление информации оптической подсистемы, АИС и РЛС [13, с. 40]. Для анализа такой функции существенны система координат, момент наблюдения и погрешность: сравнивать необработанные числа без их приведения к сопоставимому виду недостаточно. Например, после изменения движения цели прежнее сообщение и новое измерение могут расходиться без отказа датчика. Это объясняет, почему в исследовании наряду с координатами необходимо учитывать возраст данных и качество сопровождения. Конкретный алгоритм объединения наблюдений и его параметры должны устанавливаться по документации рассматриваемого комплекса.</w:t>
+      </w:r>
+    </w:p>
+    <w:p>
+      <w:pPr>
+        <w:pStyle w:val="BodyText"/>
+      </w:pPr>
+      <w:r>
+        <w:rPr>
+          <w:b w:val="0"/>
+        </w:rPr>
+        <w:t xml:space="preserve">Навигационная модель связывает сведения о целях с положением собственного судна и ограничениями акватории. Для плоского описания движения используются координаты положения, курс, продольная и поперечная скорости и угловая скорость рыскания. В модели морского судна Фоссена эти величины разделены на положение и ориентацию относительно неподвижной системы координат и скорости в системе, связанной с корпусом. Динамическая часть учитывает инерцию, присоединённые массы, гидродинамическое сопротивление, управляющие силы и внешние воздействия [17, разделы Mathematical Formulation и 3-DOF Surface Craft]. Практический смысл такого разделения состоит в том, что намеченная линия движения должна быть достижима судном с его текущей скоростью и управляемостью. Геометрически свободный поворот ещё требует проверки по динамике движения.</w:t>
+      </w:r>
+    </w:p>
+    <w:p>
+      <w:pPr>
+        <w:pStyle w:val="BodyText"/>
+      </w:pPr>
+      <w:r>
+        <w:rPr>
+          <w:b w:val="0"/>
+        </w:rPr>
+        <w:t xml:space="preserve">При оценке опасности рассчитывается взаимное положение судна и целей относительно планируемого движения. В учебном описании модуля предупреждения столкновений используются координаты, путевые углы и скорости целей, сведения о собственном судне, маршрут, береговые границы, мели и другие ограничения. По этим данным модуль выделяет опасные цели и нарушения ограничений, после чего рассчитывает варианты расхождения [14, с. 55–56]. Здесь прослеживается переход от наблюдения к решению: отметка цели становится основанием для манёвра только после оценки её движения и связи с доступным путём. Для узкости этот этап особенно важен, поскольку действие, увеличивающее расстояние до одного судна, может приблизить собственное судно к границе безопасных глубин.</w:t>
+      </w:r>
+    </w:p>
+    <w:p>
+      <w:pPr>
+        <w:pStyle w:val="BodyText"/>
+      </w:pPr>
+      <w:r>
+        <w:rPr>
+          <w:b w:val="0"/>
+        </w:rPr>
+        <w:t xml:space="preserve">Построитель движения формирует последовательность допустимых положений судна и изменения скорости. Исходный маршрут задаёт общий путь, а локальный манёвр уточняет его с учётом текущей обстановки. При проверке варианта должны учитываться другие суда, неподвижные опасности и возможность его исполнения. Кодекс MASS требует, чтобы действия по предотвращению столкновения, навала или посадки на мель не создавали иной ситуации с неприемлемым риском [1, с. 39–40]. Поэтому результат работы этого модуля нельзя описывать только командой «повернуть вправо». Требуется определить, где начинается поворот, как изменяется движение, остаётся ли судно в допустимом пространстве и как оно продолжает переход после расхождения.</w:t>
+      </w:r>
+    </w:p>
+    <w:p>
+      <w:pPr>
+        <w:pStyle w:val="BodyText"/>
+      </w:pPr>
+      <w:r>
+        <w:rPr>
+          <w:b w:val="0"/>
+        </w:rPr>
+        <w:t xml:space="preserve">Следующий уровень отвечает за движение по выбранному пути. Система управления маршрутом сравнивает положение судна с активным участком и рассчитывает задание для авторулевого. В режиме удержания линии пути регулируемой величиной является боковое отклонение от этой линии. В другом режиме система направляет судно к путевой точке; возвращение на исходную линию при этом может не быть целью управления [14, с. 58–59]. Различие существенно для узкости: направление к одной и той же точке не означает одинаковую траекторию подхода. Следовательно, проверять нужно и координаты конечной точки, и путь, по которому система собирается к ней прийти.</w:t>
+      </w:r>
+    </w:p>
+    <w:p>
+      <w:pPr>
+        <w:pStyle w:val="BodyText"/>
+      </w:pPr>
+      <w:r>
+        <w:rPr>
+          <w:b w:val="0"/>
+        </w:rPr>
+        <w:t xml:space="preserve">Авторулевой работает с заданием курса. Он сопоставляет его с измеренным курсом и формирует управляющее воздействие, изменяющее движение судна. В рассмотренной схеме контур управления маршрутом задаёт курс, а внутренний контур курса участвует в устранении бокового отклонения [14, с. 58]. Исполнительный уровень реализует команды через имеющиеся на судне средства: рулевую машину, управление главным двигателем, винторулевыми колонками либо другими движителями. Их объединение с мостиковыми средствами описывается как взаимодействие подсистем интегрированной системы управления [15, с. 5–6]. После воздействия вновь измеряются движение судна и состояние механизмов. Если фактический поворот не соответствует ожидаемому, следующая команда формируется уже с учётом этого расхождения.</w:t>
+      </w:r>
+    </w:p>
+    <w:p>
+      <w:pPr>
+        <w:pStyle w:val="BodyText"/>
+      </w:pPr>
+      <w:r>
+        <w:rPr>
+          <w:b w:val="0"/>
+        </w:rPr>
+        <w:t xml:space="preserve">Разделение уровней объясняет отличие авторулевого от автономного судовождения. Удержание заданного курса является задачей исполнения. Выбор самого курса с учётом встречного судна, глубин и применимых требований относится к более высоким уровням. Система может точно вести судно по заданной линии, но для безопасного автономного прохода дополнительно требуются обнаружение объектов, оценка ситуации и изменение плана движения. В таблице 1.2 приведена функциональная схема, составленная по рассмотренным источникам; она не задаёт обязательную комплектацию любого автономного судна.</w:t>
+      </w:r>
+    </w:p>
+    <w:p>
+      <w:pPr>
+        <w:pStyle w:val="BodyText"/>
+        <w:keepNext/>
+        <w:ind w:firstLine="0"/>
+        <w:jc w:val="left"/>
+      </w:pPr>
+      <w:r>
+        <w:rPr>
+          <w:rFonts w:ascii="Times New Roman" w:hAnsi="Times New Roman"/>
+          <w:b w:val="0"/>
+          <w:sz w:val="24"/>
+        </w:rPr>
+        <w:t xml:space="preserve">Таблица 1.2 — Передача данных и команд в системе автономного судовождения</w:t>
+      </w:r>
+    </w:p>
+    <w:tbl>
+      <w:tblPr>
+        <w:tblStyle w:val="TableGrid"/>
+        <w:tblW w:type="pct" w:w="5000"/>
+        <w:jc w:val="left"/>
+        <w:tblLayout w:type="fixed"/>
+        <w:tblLook w:firstRow="1" w:lastRow="0" w:firstColumn="0" w:lastColumn="0" w:noHBand="0" w:noVBand="0" w:val="0020"/>
+      </w:tblPr>
+      <w:tblGrid>
+        <w:gridCol w:w="2381"/>
+        <w:gridCol w:w="3288"/>
+        <w:gridCol w:w="3685"/>
+      </w:tblGrid>
+      <w:tr>
+        <w:trPr>
+          <w:tblHeader w:val="true"/>
+          <w:cantSplit/>
+        </w:trPr>
+        <w:tc>
+          <w:tcPr>
+            <w:tcW w:type="dxa" w:w="2381"/>
+          </w:tcPr>
+          <w:p>
+            <w:pPr>
+              <w:keepNext/>
+              <w:spacing w:line="240" w:lineRule="auto" w:before="0" w:after="0"/>
+              <w:ind w:firstLine="0"/>
+              <w:jc w:val="left"/>
+            </w:pPr>
+            <w:r>
+              <w:rPr>
+                <w:rFonts w:ascii="Times New Roman" w:hAnsi="Times New Roman"/>
+                <w:b w:val="0"/>
+                <w:sz w:val="24"/>
+              </w:rPr>
+              <w:t xml:space="preserve">Звено системы</w:t>
+            </w:r>
+          </w:p>
+        </w:tc>
+        <w:tc>
+          <w:tcPr>
+            <w:tcW w:type="dxa" w:w="3288"/>
+          </w:tcPr>
+          <w:p>
+            <w:pPr>
+              <w:keepNext/>
+              <w:spacing w:line="240" w:lineRule="auto" w:before="0" w:after="0"/>
+              <w:ind w:firstLine="0"/>
+              <w:jc w:val="left"/>
+            </w:pPr>
+            <w:r>
+              <w:rPr>
+                <w:rFonts w:ascii="Times New Roman" w:hAnsi="Times New Roman"/>
+                <w:b w:val="0"/>
+                <w:sz w:val="24"/>
+              </w:rPr>
+              <w:t xml:space="preserve">Входные данные</w:t>
+            </w:r>
+          </w:p>
+        </w:tc>
+        <w:tc>
+          <w:tcPr>
+            <w:tcW w:type="dxa" w:w="3685"/>
+          </w:tcPr>
+          <w:p>
+            <w:pPr>
+              <w:keepNext/>
+              <w:spacing w:line="240" w:lineRule="auto" w:before="0" w:after="0"/>
+              <w:ind w:firstLine="0"/>
+              <w:jc w:val="left"/>
+            </w:pPr>
+            <w:r>
+              <w:rPr>
+                <w:rFonts w:ascii="Times New Roman" w:hAnsi="Times New Roman"/>
+                <w:b w:val="0"/>
+                <w:sz w:val="24"/>
+              </w:rPr>
+              <w:t xml:space="preserve">Обработка и выход</w:t>
+            </w:r>
+          </w:p>
+        </w:tc>
+      </w:tr>
+      <w:tr>
+        <w:trPr>
+          <w:cantSplit/>
+        </w:trPr>
+        <w:tc>
+          <w:tcPr>
+            <w:tcW w:type="dxa" w:w="2381"/>
+          </w:tcPr>
+          <w:p>
+            <w:pPr>
+              <w:keepNext/>
+              <w:spacing w:line="240" w:lineRule="auto" w:before="0" w:after="0"/>
+              <w:ind w:firstLine="0"/>
+              <w:jc w:val="left"/>
+            </w:pPr>
+            <w:r>
+              <w:rPr>
+                <w:rFonts w:ascii="Times New Roman" w:hAnsi="Times New Roman"/>
+                <w:b w:val="0"/>
+                <w:sz w:val="24"/>
+              </w:rPr>
+              <w:t xml:space="preserve">Оценка собственного состояния</w:t>
+            </w:r>
+          </w:p>
+        </w:tc>
+        <w:tc>
+          <w:tcPr>
+            <w:tcW w:type="dxa" w:w="3288"/>
+          </w:tcPr>
+          <w:p>
+            <w:pPr>
+              <w:keepNext/>
+              <w:spacing w:line="240" w:lineRule="auto" w:before="0" w:after="0"/>
+              <w:ind w:firstLine="0"/>
+              <w:jc w:val="left"/>
+            </w:pPr>
+            <w:r>
+              <w:rPr>
+                <w:rFonts w:ascii="Times New Roman" w:hAnsi="Times New Roman"/>
+                <w:b w:val="0"/>
+                <w:sz w:val="24"/>
+              </w:rPr>
+              <w:t xml:space="preserve">Измерения положения, курса, скорости, поворота</w:t>
+            </w:r>
+          </w:p>
+        </w:tc>
+        <w:tc>
+          <w:tcPr>
+            <w:tcW w:type="dxa" w:w="3685"/>
+          </w:tcPr>
+          <w:p>
+            <w:pPr>
+              <w:keepNext/>
+              <w:spacing w:line="240" w:lineRule="auto" w:before="0" w:after="0"/>
+              <w:ind w:firstLine="0"/>
+              <w:jc w:val="left"/>
+            </w:pPr>
+            <w:r>
+              <w:rPr>
+                <w:rFonts w:ascii="Times New Roman" w:hAnsi="Times New Roman"/>
+                <w:b w:val="0"/>
+                <w:sz w:val="24"/>
+              </w:rPr>
+              <w:t xml:space="preserve">Оценка положения и движения своего судна</w:t>
+            </w:r>
+          </w:p>
+        </w:tc>
+      </w:tr>
+      <w:tr>
+        <w:trPr>
+          <w:cantSplit/>
+        </w:trPr>
+        <w:tc>
+          <w:tcPr>
+            <w:tcW w:type="dxa" w:w="2381"/>
+          </w:tcPr>
+          <w:p>
+            <w:pPr>
+              <w:keepNext/>
+              <w:spacing w:line="240" w:lineRule="auto" w:before="0" w:after="0"/>
+              <w:ind w:firstLine="0"/>
+              <w:jc w:val="left"/>
+            </w:pPr>
+            <w:r>
+              <w:rPr>
+                <w:rFonts w:ascii="Times New Roman" w:hAnsi="Times New Roman"/>
+                <w:b w:val="0"/>
+                <w:sz w:val="24"/>
+              </w:rPr>
+              <w:t xml:space="preserve">Наблюдение за объектами</w:t>
+            </w:r>
+          </w:p>
+        </w:tc>
+        <w:tc>
+          <w:tcPr>
+            <w:tcW w:type="dxa" w:w="3288"/>
+          </w:tcPr>
+          <w:p>
+            <w:pPr>
+              <w:keepNext/>
+              <w:spacing w:line="240" w:lineRule="auto" w:before="0" w:after="0"/>
+              <w:ind w:firstLine="0"/>
+              <w:jc w:val="left"/>
+            </w:pPr>
+            <w:r>
+              <w:rPr>
+                <w:rFonts w:ascii="Times New Roman" w:hAnsi="Times New Roman"/>
+                <w:b w:val="0"/>
+                <w:sz w:val="24"/>
+              </w:rPr>
+              <w:t xml:space="preserve">Радиолокационные и оптические наблюдения, сообщения АИС</w:t>
+            </w:r>
+          </w:p>
+        </w:tc>
+        <w:tc>
+          <w:tcPr>
+            <w:tcW w:type="dxa" w:w="3685"/>
+          </w:tcPr>
+          <w:p>
+            <w:pPr>
+              <w:keepNext/>
+              <w:spacing w:line="240" w:lineRule="auto" w:before="0" w:after="0"/>
+              <w:ind w:firstLine="0"/>
+              <w:jc w:val="left"/>
+            </w:pPr>
+            <w:r>
+              <w:rPr>
+                <w:rFonts w:ascii="Times New Roman" w:hAnsi="Times New Roman"/>
+                <w:b w:val="0"/>
+                <w:sz w:val="24"/>
+              </w:rPr>
+              <w:t xml:space="preserve">Обнаруженные цели, доступные признаки и параметры</w:t>
+            </w:r>
+          </w:p>
+        </w:tc>
+      </w:tr>
+      <w:tr>
+        <w:trPr>
+          <w:cantSplit/>
+        </w:trPr>
+        <w:tc>
+          <w:tcPr>
+            <w:tcW w:type="dxa" w:w="2381"/>
+          </w:tcPr>
+          <w:p>
+            <w:pPr>
+              <w:keepNext/>
+              <w:spacing w:line="240" w:lineRule="auto" w:before="0" w:after="0"/>
+              <w:ind w:firstLine="0"/>
+              <w:jc w:val="left"/>
+            </w:pPr>
+            <w:r>
+              <w:rPr>
+                <w:rFonts w:ascii="Times New Roman" w:hAnsi="Times New Roman"/>
+                <w:b w:val="0"/>
+                <w:sz w:val="24"/>
+              </w:rPr>
+              <w:t xml:space="preserve">Согласование наблюдений</w:t>
+            </w:r>
+          </w:p>
+        </w:tc>
+        <w:tc>
+          <w:tcPr>
+            <w:tcW w:type="dxa" w:w="3288"/>
+          </w:tcPr>
+          <w:p>
+            <w:pPr>
+              <w:keepNext/>
+              <w:spacing w:line="240" w:lineRule="auto" w:before="0" w:after="0"/>
+              <w:ind w:firstLine="0"/>
+              <w:jc w:val="left"/>
+            </w:pPr>
+            <w:r>
+              <w:rPr>
+                <w:rFonts w:ascii="Times New Roman" w:hAnsi="Times New Roman"/>
+                <w:b w:val="0"/>
+                <w:sz w:val="24"/>
+              </w:rPr>
+              <w:t xml:space="preserve">Записи разных источников и моменты измерений</w:t>
+            </w:r>
+          </w:p>
+        </w:tc>
+        <w:tc>
+          <w:tcPr>
+            <w:tcW w:type="dxa" w:w="3685"/>
+          </w:tcPr>
+          <w:p>
+            <w:pPr>
+              <w:keepNext/>
+              <w:spacing w:line="240" w:lineRule="auto" w:before="0" w:after="0"/>
+              <w:ind w:firstLine="0"/>
+              <w:jc w:val="left"/>
+            </w:pPr>
+            <w:r>
+              <w:rPr>
+                <w:rFonts w:ascii="Times New Roman" w:hAnsi="Times New Roman"/>
+                <w:b w:val="0"/>
+                <w:sz w:val="24"/>
+              </w:rPr>
+              <w:t xml:space="preserve">Сопоставленные формуляры целей, выявленные расхождения</w:t>
+            </w:r>
+          </w:p>
+        </w:tc>
+      </w:tr>
+      <w:tr>
+        <w:trPr>
+          <w:cantSplit/>
+        </w:trPr>
+        <w:tc>
+          <w:tcPr>
+            <w:tcW w:type="dxa" w:w="2381"/>
+          </w:tcPr>
+          <w:p>
+            <w:pPr>
+              <w:keepNext/>
+              <w:spacing w:line="240" w:lineRule="auto" w:before="0" w:after="0"/>
+              <w:ind w:firstLine="0"/>
+              <w:jc w:val="left"/>
+            </w:pPr>
+            <w:r>
+              <w:rPr>
+                <w:rFonts w:ascii="Times New Roman" w:hAnsi="Times New Roman"/>
+                <w:b w:val="0"/>
+                <w:sz w:val="24"/>
+              </w:rPr>
+              <w:t xml:space="preserve">Оценка опасности и планирование</w:t>
+            </w:r>
+          </w:p>
+        </w:tc>
+        <w:tc>
+          <w:tcPr>
+            <w:tcW w:type="dxa" w:w="3288"/>
+          </w:tcPr>
+          <w:p>
+            <w:pPr>
+              <w:keepNext/>
+              <w:spacing w:line="240" w:lineRule="auto" w:before="0" w:after="0"/>
+              <w:ind w:firstLine="0"/>
+              <w:jc w:val="left"/>
+            </w:pPr>
+            <w:r>
+              <w:rPr>
+                <w:rFonts w:ascii="Times New Roman" w:hAnsi="Times New Roman"/>
+                <w:b w:val="0"/>
+                <w:sz w:val="24"/>
+              </w:rPr>
+              <w:t xml:space="preserve">Цели, маршрут, ограничения акватории, характеристики судна</w:t>
+            </w:r>
+          </w:p>
+        </w:tc>
+        <w:tc>
+          <w:tcPr>
+            <w:tcW w:type="dxa" w:w="3685"/>
+          </w:tcPr>
+          <w:p>
+            <w:pPr>
+              <w:keepNext/>
+              <w:spacing w:line="240" w:lineRule="auto" w:before="0" w:after="0"/>
+              <w:ind w:firstLine="0"/>
+              <w:jc w:val="left"/>
+            </w:pPr>
+            <w:r>
+              <w:rPr>
+                <w:rFonts w:ascii="Times New Roman" w:hAnsi="Times New Roman"/>
+                <w:b w:val="0"/>
+                <w:sz w:val="24"/>
+              </w:rPr>
+              <w:t xml:space="preserve">Допустимый вариант движения или выявленное ограничение</w:t>
+            </w:r>
+          </w:p>
+        </w:tc>
+      </w:tr>
+      <w:tr>
+        <w:trPr>
+          <w:cantSplit/>
+        </w:trPr>
+        <w:tc>
+          <w:tcPr>
+            <w:tcW w:type="dxa" w:w="2381"/>
+          </w:tcPr>
+          <w:p>
+            <w:pPr>
+              <w:keepNext/>
+              <w:spacing w:line="240" w:lineRule="auto" w:before="0" w:after="0"/>
+              <w:ind w:firstLine="0"/>
+              <w:jc w:val="left"/>
+            </w:pPr>
+            <w:r>
+              <w:rPr>
+                <w:rFonts w:ascii="Times New Roman" w:hAnsi="Times New Roman"/>
+                <w:b w:val="0"/>
+                <w:sz w:val="24"/>
+              </w:rPr>
+              <w:t xml:space="preserve">Управление маршрутом и курсом</w:t>
+            </w:r>
+          </w:p>
+        </w:tc>
+        <w:tc>
+          <w:tcPr>
+            <w:tcW w:type="dxa" w:w="3288"/>
+          </w:tcPr>
+          <w:p>
+            <w:pPr>
+              <w:keepNext/>
+              <w:spacing w:line="240" w:lineRule="auto" w:before="0" w:after="0"/>
+              <w:ind w:firstLine="0"/>
+              <w:jc w:val="left"/>
+            </w:pPr>
+            <w:r>
+              <w:rPr>
+                <w:rFonts w:ascii="Times New Roman" w:hAnsi="Times New Roman"/>
+                <w:b w:val="0"/>
+                <w:sz w:val="24"/>
+              </w:rPr>
+              <w:t xml:space="preserve">План движения и фактическое состояние судна</w:t>
+            </w:r>
+          </w:p>
+        </w:tc>
+        <w:tc>
+          <w:tcPr>
+            <w:tcW w:type="dxa" w:w="3685"/>
+          </w:tcPr>
+          <w:p>
+            <w:pPr>
+              <w:keepNext/>
+              <w:spacing w:line="240" w:lineRule="auto" w:before="0" w:after="0"/>
+              <w:ind w:firstLine="0"/>
+              <w:jc w:val="left"/>
+            </w:pPr>
+            <w:r>
+              <w:rPr>
+                <w:rFonts w:ascii="Times New Roman" w:hAnsi="Times New Roman"/>
+                <w:b w:val="0"/>
+                <w:sz w:val="24"/>
+              </w:rPr>
+              <w:t xml:space="preserve">Задания курса и скорости, управляющие воздействия</w:t>
+            </w:r>
+          </w:p>
+        </w:tc>
+      </w:tr>
+      <w:tr>
+        <w:trPr>
+          <w:cantSplit/>
+        </w:trPr>
+        <w:tc>
+          <w:tcPr>
+            <w:tcW w:type="dxa" w:w="2381"/>
+          </w:tcPr>
+          <w:p>
+            <w:pPr>
+              <w:keepNext w:val="0"/>
+              <w:spacing w:line="240" w:lineRule="auto" w:before="0" w:after="0"/>
+              <w:ind w:firstLine="0"/>
+              <w:jc w:val="left"/>
+            </w:pPr>
+            <w:r>
+              <w:rPr>
+                <w:rFonts w:ascii="Times New Roman" w:hAnsi="Times New Roman"/>
+                <w:b w:val="0"/>
+                <w:sz w:val="24"/>
+              </w:rPr>
+              <w:t xml:space="preserve">Исполнение и контроль</w:t>
+            </w:r>
+          </w:p>
+        </w:tc>
+        <w:tc>
+          <w:tcPr>
+            <w:tcW w:type="dxa" w:w="3288"/>
+          </w:tcPr>
+          <w:p>
+            <w:pPr>
+              <w:keepNext w:val="0"/>
+              <w:spacing w:line="240" w:lineRule="auto" w:before="0" w:after="0"/>
+              <w:ind w:firstLine="0"/>
+              <w:jc w:val="left"/>
+            </w:pPr>
+            <w:r>
+              <w:rPr>
+                <w:rFonts w:ascii="Times New Roman" w:hAnsi="Times New Roman"/>
+                <w:b w:val="0"/>
+                <w:sz w:val="24"/>
+              </w:rPr>
+              <w:t xml:space="preserve">Команды, состояние рулевой и энергетической установок</w:t>
+            </w:r>
+          </w:p>
+        </w:tc>
+        <w:tc>
+          <w:tcPr>
+            <w:tcW w:type="dxa" w:w="3685"/>
+          </w:tcPr>
+          <w:p>
+            <w:pPr>
+              <w:keepNext w:val="0"/>
+              <w:spacing w:line="240" w:lineRule="auto" w:before="0" w:after="0"/>
+              <w:ind w:firstLine="0"/>
+              <w:jc w:val="left"/>
+            </w:pPr>
+            <w:r>
+              <w:rPr>
+                <w:rFonts w:ascii="Times New Roman" w:hAnsi="Times New Roman"/>
+                <w:b w:val="0"/>
+                <w:sz w:val="24"/>
+              </w:rPr>
+              <w:t xml:space="preserve">Изменение движения, обратная связь и сигналы отклонений</w:t>
+            </w:r>
+          </w:p>
+        </w:tc>
+      </w:tr>
+    </w:tbl>
+    <w:p>
+      <w:pPr>
+        <w:pStyle w:val="BodyText"/>
+      </w:pPr>
+      <w:r>
+        <w:rPr>
+          <w:b w:val="0"/>
+        </w:rPr>
+        <w:t xml:space="preserve">Связи между звеньями определяют, какую причину ошибки следует искать. Пропущенная цель относится к наблюдению; неверное сопоставление записей — к обработке данных; опасная траектория при правильно обнаруженной цели — к оценке и планированию; невыполненный поворот при правильном задании — к управлению или исполнению. Такое разделение позволяет проверять конкретную функцию, вместо того чтобы оценивать весь комплекс по общему обозначению «автономный» [1, с. 24, 39–40; 13, с. 39–40; 14, с. 55–59; 15, с. 5–6].</w:t>
+      </w:r>
+    </w:p>
+    <w:p>
+      <w:pPr>
+        <w:pStyle w:val="BodyText"/>
+      </w:pPr>
+      <w:r>
+        <w:rPr>
+          <w:b w:val="0"/>
+        </w:rPr>
+        <w:t xml:space="preserve">Береговой центр добавляет канал наблюдения и управления. В учебном примере комплекса «БЭС-КФ» отдельно выделены автономная навигационная система, оптические средства, пульт дистанционного управления, обмен данными и диагностика [11, с. 11–13]. В автономном режиме действия формируются соответствующими судовыми функциями; при дистанционном управлении в принятии решений участвует удалённый оператор. Для анализа необходимо установить, какие данные передаются на берег, какие команды допускаются и как подтверждается их исполнение. Кодекс MASS предусматривает определение характеристик каналов связи с учётом потребностей выполняемых функций [1, с. 41–42]. Поэтому один факт наличия связи не описывает возможности дистанционного управления в конкретной ситуации.</w:t>
+      </w:r>
+    </w:p>
+    <w:p>
+      <w:pPr>
+        <w:pStyle w:val="BodyText"/>
+      </w:pPr>
+      <w:r>
+        <w:rPr>
+          <w:b w:val="0"/>
+        </w:rPr>
+        <w:t xml:space="preserve">Передача управления человеку требует отдельной процедуры. В рассмотренном комплексе механический переключатель на мостике позволяет отключить автономную навигационную систему от средств управления исполнительными устройствами [15, с. 9]. Организационная часть перехода должна определять, кто принимает управление и какая информация ему доступна. При выходе за эксплуатационные границы Кодекс предусматривает заранее определённое резервное состояние и оценённые действия перехода к нему [1, с. 21–22]. Для узкости нельзя заранее выбрать универсальную реакцию: остановка, продолжение движения с ограничениями или передача управления оцениваются с учётом оставшегося пространства, течения и других судов.</w:t>
+      </w:r>
+    </w:p>
+    <w:p>
+      <w:pPr>
+        <w:pStyle w:val="BodyText"/>
+      </w:pPr>
+      <w:r>
+        <w:rPr>
+          <w:b w:val="0"/>
+        </w:rPr>
+        <w:t xml:space="preserve">Диагностика и регистрация данных замыкают проверку системы. Неполные наблюдения, прерывание связи и расхождение модели с фактической обстановкой являются основаниями выяснять причину нарушения; сами по себе такие симптомы не устанавливают кибератаку [16, с. 23–24]. Записи исходных данных, решений и команд позволяют восстановить, на каком звене возникла ошибка. Кодекс предусматривает регистрацию операций и проверку технических систем, включая интеграционные и системные испытания [1, с. 24]. В дальнейшем эти сведения используются для оценки того, какие функции российского или зарубежного проекта подтверждены именно в условиях, существенных для плавания в узкостях.</w:t>
+      </w:r>
+    </w:p>
+    <w:bookmarkEnd w:id="22"/>
+    <w:bookmarkStart w:id="23" w:name="Xdf1b120d09c46bd257b0f81b78a36e02e7173f6"/>
+    <w:p>
+      <w:pPr>
+        <w:pStyle w:val="Heading2"/>
+      </w:pPr>
+      <w:r>
+        <w:rPr>
+          <w:rFonts w:ascii="Times New Roman" w:hAnsi="Times New Roman"/>
+          <w:color w:val="000000"/>
+          <w:sz w:val="28"/>
+        </w:rPr>
+        <w:t xml:space="preserve">1.4 Основные навигационные проблемы при плавании в узкостях</w:t>
+      </w:r>
+    </w:p>
+    <w:p>
+      <w:pPr>
+        <w:pStyle w:val="FirstParagraph"/>
       </w:pPr>
       <w:r>
         <w:rPr>
@@ -805,8 +1383,8 @@
         <w:t xml:space="preserve">Таким образом, описание узкости для настоящего исследования включает геометрию пути и глубины, характеристики судна, движение других участников, видимость и гидрометеорологические условия, связь с берегом и доступные действия при ухудшении обстановки. Дальнейшее сравнение будет строиться по этим условиям. Прохождение маршрута в открытом море, подтверждённое источником, необходимо отличать от выполнения навигационных задач в узкости, даже если оба участка входят в один рейс.</w:t>
       </w:r>
     </w:p>
-    <w:bookmarkEnd w:id="22"/>
-    <w:bookmarkStart w:id="23" w:name="Xe5e5bc2f85bda039cae810321abad93f268cc24"/>
+    <w:bookmarkEnd w:id="23"/>
+    <w:bookmarkStart w:id="24" w:name="X6b846899848c399b3f450104d757d889aba5580"/>
     <w:p>
       <w:pPr>
         <w:pStyle w:val="Heading2"/>
@@ -817,7 +1395,7 @@
           <w:color w:val="000000"/>
           <w:sz w:val="28"/>
         </w:rPr>
-        <w:t xml:space="preserve">1.4 Нормативные требования и границы разрешённых режимов</w:t>
+        <w:t xml:space="preserve">1.5 Международные требования к безопасности автономного судовождения</w:t>
       </w:r>
     </w:p>
     <w:p>
@@ -908,9 +1486,9 @@
         <w:t xml:space="preserve">В дальнейшем нормативный анализ будет оформлен как связь между требованием, навигационной функцией, условиями её использования и подтверждением. Такая связь нужна, чтобы не смешивать наличие разработки, разрешение испытания, сертификацию отдельного режима и доказательство пригодности для узкости. При отсутствии первичного документа об условиях одобрения соответствующее утверждение будет обозначаться как сообщение участника проекта. Окончательная оценка российского нормативного блока должна учитывать действующие национальные документы и ограничения разрешённых режимов.</w:t>
       </w:r>
     </w:p>
-    <w:bookmarkEnd w:id="23"/>
     <w:bookmarkEnd w:id="24"/>
-    <w:bookmarkStart w:id="32" w:name="список-использованных-источников"/>
+    <w:bookmarkEnd w:id="25"/>
+    <w:bookmarkStart w:id="39" w:name="список-использованных-источников"/>
     <w:p>
       <w:pPr>
         <w:pStyle w:val="Heading1"/>
@@ -940,7 +1518,7 @@
         </w:rPr>
         <w:t xml:space="preserve"> </w:t>
       </w:r>
-      <w:hyperlink r:id="rId25">
+      <w:hyperlink r:id="rId26">
         <w:r>
           <w:rPr>
             <w:rStyle w:val="Hyperlink"/>
@@ -977,7 +1555,7 @@
         </w:rPr>
         <w:t xml:space="preserve"> </w:t>
       </w:r>
-      <w:hyperlink r:id="rId26">
+      <w:hyperlink r:id="rId27">
         <w:r>
           <w:rPr>
             <w:rStyle w:val="Hyperlink"/>
@@ -1014,7 +1592,7 @@
         </w:rPr>
         <w:t xml:space="preserve"> </w:t>
       </w:r>
-      <w:hyperlink r:id="rId27">
+      <w:hyperlink r:id="rId28">
         <w:r>
           <w:rPr>
             <w:rStyle w:val="Hyperlink"/>
@@ -1051,7 +1629,7 @@
         </w:rPr>
         <w:t xml:space="preserve"> </w:t>
       </w:r>
-      <w:hyperlink r:id="rId28">
+      <w:hyperlink r:id="rId29">
         <w:r>
           <w:rPr>
             <w:rStyle w:val="Hyperlink"/>
@@ -1088,7 +1666,7 @@
         </w:rPr>
         <w:t xml:space="preserve"> </w:t>
       </w:r>
-      <w:hyperlink r:id="rId29">
+      <w:hyperlink r:id="rId30">
         <w:r>
           <w:rPr>
             <w:rStyle w:val="Hyperlink"/>
@@ -1125,7 +1703,7 @@
         </w:rPr>
         <w:t xml:space="preserve"> </w:t>
       </w:r>
-      <w:hyperlink r:id="rId30">
+      <w:hyperlink r:id="rId31">
         <w:r>
           <w:rPr>
             <w:rStyle w:val="Hyperlink"/>
@@ -1162,7 +1740,7 @@
         </w:rPr>
         <w:t xml:space="preserve"> </w:t>
       </w:r>
-      <w:hyperlink r:id="rId31">
+      <w:hyperlink r:id="rId32">
         <w:r>
           <w:rPr>
             <w:rStyle w:val="Hyperlink"/>
@@ -1191,40 +1769,33 @@
         <w:rPr>
           <w:b w:val="0"/>
         </w:rPr>
-        <w:t xml:space="preserve">11 Раздел 2. Принципы организации структуры МАНС : учебный материал [Электронный ресурс]. — [Б. м. : б. и.], [б. г.]. — 24 с. — PDF-файл, предоставленный автором ВКР 09.10.2026.</w:t>
+        <w:t xml:space="preserve">8 Sitronics Group. Компания Sitronics KT продемонстрировала автономное судовождение в реальных условиях. — 11.05.2021. — URL:</w:t>
       </w:r>
-    </w:p>
-    <w:p>
-      <w:pPr>
-        <w:pStyle w:val="BodyText"/>
-      </w:pPr>
       <w:r>
         <w:rPr>
           <w:b w:val="0"/>
         </w:rPr>
-        <w:t xml:space="preserve">12 Раздел 4. Технические средства судовождения МАНС : учебный материал [Электронный ресурс]. — [Б. м. : б. и.], [б. г.]. — 25 с. — PDF-файл, предоставленный автором ВКР 09.10.2026.</w:t>
+        <w:t xml:space="preserve"> </w:t>
       </w:r>
-    </w:p>
-    <w:p>
-      <w:pPr>
-        <w:pStyle w:val="BodyText"/>
-      </w:pPr>
+      <w:hyperlink r:id="rId33">
+        <w:r>
+          <w:rPr>
+            <w:rStyle w:val="Hyperlink"/>
+          </w:rPr>
+          <w:t xml:space="preserve">https://www.sitronics.com/reports/6966</w:t>
+        </w:r>
+      </w:hyperlink>
       <w:r>
         <w:rPr>
           <w:b w:val="0"/>
         </w:rPr>
-        <w:t xml:space="preserve">13 Раздел 5. Информационные потоки МАНС : учебный материал [Электронный ресурс]. — [Б. м. : б. и.], [б. г.]. — 49 с. — PDF-файл, предоставленный автором ВКР 09.10.2026.</w:t>
+        <w:t xml:space="preserve"> </w:t>
       </w:r>
-    </w:p>
-    <w:p>
-      <w:pPr>
-        <w:pStyle w:val="BodyText"/>
-      </w:pPr>
       <w:r>
         <w:rPr>
           <w:b w:val="0"/>
         </w:rPr>
-        <w:t xml:space="preserve">14 Раздел 3. Математические основы средств автономности судна : учебный материал [Электронный ресурс]. — [Б. м. : б. и.], [б. г.]. — 69 с. — PDF-файл, предоставленный автором ВКР 09.10.2026.</w:t>
+        <w:t xml:space="preserve">(дата обращения: 09.10.2026).</w:t>
       </w:r>
     </w:p>
     <w:p>
@@ -1235,21 +1806,250 @@
         <w:rPr>
           <w:b w:val="0"/>
         </w:rPr>
-        <w:t xml:space="preserve">15 Раздел 8. Управление МАНС : учебный материал [Электронный ресурс]. — [Б. м. : б. и.], [б. г.]. — 18 с. — PDF-файл, предоставленный автором ВКР 09.10.2026.</w:t>
+        <w:t xml:space="preserve">9 Sitronics Group. В России началась коммерческая эксплуатация первого морского судна в режиме дистанционного управления: паром «Генерал Черняховский» начал автономный рейс. — 19.12.2023. — URL:</w:t>
       </w:r>
-    </w:p>
-    <w:p>
-      <w:pPr>
-        <w:pStyle w:val="BodyText"/>
-      </w:pPr>
       <w:r>
         <w:rPr>
           <w:b w:val="0"/>
         </w:rPr>
-        <w:t xml:space="preserve">16 Раздел 7. Кибербезопасность : учебный материал [Электронный ресурс]. — [Б. м. : б. и.], [б. г.]. — 35 с. — PDF-файл, предоставленный автором ВКР 09.10.2026.</w:t>
+        <w:t xml:space="preserve"> </w:t>
+      </w:r>
+      <w:hyperlink r:id="rId34">
+        <w:r>
+          <w:rPr>
+            <w:rStyle w:val="Hyperlink"/>
+          </w:rPr>
+          <w:t xml:space="preserve">https://www.sitronics.com/reports/15592</w:t>
+        </w:r>
+      </w:hyperlink>
+      <w:r>
+        <w:rPr>
+          <w:b w:val="0"/>
+        </w:rPr>
+        <w:t xml:space="preserve"> </w:t>
+      </w:r>
+      <w:r>
+        <w:rPr>
+          <w:b w:val="0"/>
+        </w:rPr>
+        <w:t xml:space="preserve">(дата обращения: 09.10.2026).</w:t>
       </w:r>
     </w:p>
-    <w:bookmarkEnd w:id="32"/>
+    <w:p>
+      <w:pPr>
+        <w:pStyle w:val="BodyText"/>
+      </w:pPr>
+      <w:r>
+        <w:rPr>
+          <w:b w:val="0"/>
+        </w:rPr>
+        <w:t xml:space="preserve">10 Sitronics Group. Безэкипажный катер Sitronics KT доставил бюллетени для голосования и избирательную документацию на островные территории Архангельской области. — 15.09.2026. — URL:</w:t>
+      </w:r>
+      <w:r>
+        <w:rPr>
+          <w:b w:val="0"/>
+        </w:rPr>
+        <w:t xml:space="preserve"> </w:t>
+      </w:r>
+      <w:hyperlink r:id="rId35">
+        <w:r>
+          <w:rPr>
+            <w:rStyle w:val="Hyperlink"/>
+          </w:rPr>
+          <w:t xml:space="preserve">https://www.sitronics.com/reports/18730</w:t>
+        </w:r>
+      </w:hyperlink>
+      <w:r>
+        <w:rPr>
+          <w:b w:val="0"/>
+        </w:rPr>
+        <w:t xml:space="preserve"> </w:t>
+      </w:r>
+      <w:r>
+        <w:rPr>
+          <w:b w:val="0"/>
+        </w:rPr>
+        <w:t xml:space="preserve">(дата обращения: 09.10.2026).</w:t>
+      </w:r>
+    </w:p>
+    <w:p>
+      <w:pPr>
+        <w:pStyle w:val="BodyText"/>
+      </w:pPr>
+      <w:r>
+        <w:rPr>
+          <w:b w:val="0"/>
+        </w:rPr>
+        <w:t xml:space="preserve">11 Раздел 2. Принципы организации структуры МАНС : учебный материал [Электронный ресурс] // СДО «Фарватер». — [Б. г.]. — 24 с.</w:t>
+      </w:r>
+    </w:p>
+    <w:p>
+      <w:pPr>
+        <w:pStyle w:val="BodyText"/>
+      </w:pPr>
+      <w:r>
+        <w:rPr>
+          <w:b w:val="0"/>
+        </w:rPr>
+        <w:t xml:space="preserve">12 Раздел 4. Технические средства судовождения МАНС : учебный материал [Электронный ресурс] // СДО «Фарватер». — [Б. г.]. — 25 с.</w:t>
+      </w:r>
+    </w:p>
+    <w:p>
+      <w:pPr>
+        <w:pStyle w:val="BodyText"/>
+      </w:pPr>
+      <w:r>
+        <w:rPr>
+          <w:b w:val="0"/>
+        </w:rPr>
+        <w:t xml:space="preserve">13 Раздел 5. Информационные потоки МАНС : учебный материал [Электронный ресурс] // СДО «Фарватер». — [Б. г.]. — 49 с.</w:t>
+      </w:r>
+    </w:p>
+    <w:p>
+      <w:pPr>
+        <w:pStyle w:val="BodyText"/>
+      </w:pPr>
+      <w:r>
+        <w:rPr>
+          <w:b w:val="0"/>
+        </w:rPr>
+        <w:t xml:space="preserve">14 Раздел 3. Математические основы средств автономности судна : учебный материал [Электронный ресурс] // СДО «Фарватер». — [Б. г.]. — 69 с.</w:t>
+      </w:r>
+    </w:p>
+    <w:p>
+      <w:pPr>
+        <w:pStyle w:val="BodyText"/>
+      </w:pPr>
+      <w:r>
+        <w:rPr>
+          <w:b w:val="0"/>
+        </w:rPr>
+        <w:t xml:space="preserve">15 Раздел 8. Управление МАНС : учебный материал [Электронный ресурс] // СДО «Фарватер». — [Б. г.]. — 18 с.</w:t>
+      </w:r>
+    </w:p>
+    <w:p>
+      <w:pPr>
+        <w:pStyle w:val="BodyText"/>
+      </w:pPr>
+      <w:r>
+        <w:rPr>
+          <w:b w:val="0"/>
+        </w:rPr>
+        <w:t xml:space="preserve">16 Раздел 7. Кибербезопасность : учебный материал [Электронный ресурс] // СДО «Фарватер». — [Б. г.]. — 35 с.</w:t>
+      </w:r>
+    </w:p>
+    <w:p>
+      <w:pPr>
+        <w:pStyle w:val="BodyText"/>
+      </w:pPr>
+      <w:r>
+        <w:rPr>
+          <w:b w:val="0"/>
+        </w:rPr>
+        <w:t xml:space="preserve">17 Fossen T. I. Fossen’s Marine Craft Model [Электронный ресурс]. — URL:</w:t>
+      </w:r>
+      <w:r>
+        <w:rPr>
+          <w:b w:val="0"/>
+        </w:rPr>
+        <w:t xml:space="preserve"> </w:t>
+      </w:r>
+      <w:hyperlink r:id="rId36">
+        <w:r>
+          <w:rPr>
+            <w:rStyle w:val="Hyperlink"/>
+          </w:rPr>
+          <w:t xml:space="preserve">https://www.fossen.biz/html/marineCraftModel.html</w:t>
+        </w:r>
+      </w:hyperlink>
+      <w:r>
+        <w:rPr>
+          <w:b w:val="0"/>
+        </w:rPr>
+        <w:t xml:space="preserve"> </w:t>
+      </w:r>
+      <w:r>
+        <w:rPr>
+          <w:b w:val="0"/>
+        </w:rPr>
+        <w:t xml:space="preserve">(дата обращения: 09.10.2026).</w:t>
+      </w:r>
+    </w:p>
+    <w:p>
+      <w:pPr>
+        <w:pStyle w:val="BodyText"/>
+      </w:pPr>
+      <w:r>
+        <w:rPr>
+          <w:b w:val="0"/>
+        </w:rPr>
+        <w:t xml:space="preserve">18 United States Coast Guard Navigation Center. Navigation Rules: Amalgamated [Электронный ресурс] : международные положения правил 3 и 9. — URL:</w:t>
+      </w:r>
+      <w:r>
+        <w:rPr>
+          <w:b w:val="0"/>
+        </w:rPr>
+        <w:t xml:space="preserve"> </w:t>
+      </w:r>
+      <w:hyperlink r:id="rId37">
+        <w:r>
+          <w:rPr>
+            <w:rStyle w:val="Hyperlink"/>
+          </w:rPr>
+          <w:t xml:space="preserve">https://www.navcen.uscg.gov/navigation-rules-amalgamated</w:t>
+        </w:r>
+      </w:hyperlink>
+      <w:r>
+        <w:rPr>
+          <w:b w:val="0"/>
+        </w:rPr>
+        <w:t xml:space="preserve"> </w:t>
+      </w:r>
+      <w:r>
+        <w:rPr>
+          <w:b w:val="0"/>
+        </w:rPr>
+        <w:t xml:space="preserve">(дата обращения: 09.10.2026).</w:t>
+      </w:r>
+    </w:p>
+    <w:p>
+      <w:pPr>
+        <w:pStyle w:val="BodyText"/>
+      </w:pPr>
+      <w:r>
+        <w:rPr>
+          <w:b w:val="0"/>
+        </w:rPr>
+        <w:t xml:space="preserve">19 Alamoush A. S., Ölçer A. I. Maritime Autonomous Surface Ships: Architecture for Autonomous Navigation Systems // Journal of Marine Science and Engineering. — 2025. — Vol. 13, no. 1. — Art. 122. — DOI: 10.3390/jmse13010122. — URL:</w:t>
+      </w:r>
+      <w:r>
+        <w:rPr>
+          <w:b w:val="0"/>
+        </w:rPr>
+        <w:t xml:space="preserve"> </w:t>
+      </w:r>
+      <w:hyperlink r:id="rId38">
+        <w:r>
+          <w:rPr>
+            <w:rStyle w:val="Hyperlink"/>
+          </w:rPr>
+          <w:t xml:space="preserve">https://www.mdpi.com/2077-1312/13/1/122</w:t>
+        </w:r>
+      </w:hyperlink>
+      <w:r>
+        <w:rPr>
+          <w:b w:val="0"/>
+        </w:rPr>
+        <w:t xml:space="preserve"> </w:t>
+      </w:r>
+      <w:r>
+        <w:rPr>
+          <w:b w:val="0"/>
+        </w:rPr>
+        <w:t xml:space="preserve">(дата обращения: 09.10.2026).</w:t>
+      </w:r>
+    </w:p>
+    <w:bookmarkEnd w:id="39"/>
     <w:sectPr>
       <w:footerReference r:id="rId9" w:type="default"/>
       <w:pgSz w:h="16838" w:w="11906"/>
@@ -1273,13 +2073,15 @@
       <w:ind w:firstLine="0"/>
       <w:jc w:val="center"/>
     </w:pPr>
-    <w:r>
-      <w:rPr>
-        <w:rFonts w:ascii="Times New Roman" w:hAnsi="Times New Roman"/>
-        <w:sz w:val="24"/>
-      </w:rPr>
-      <w:fldSimple w:instr="PAGE"/>
-    </w:r>
+    <w:fldSimple w:instr="PAGE">
+      <w:r>
+        <w:rPr>
+          <w:rFonts w:ascii="Times New Roman" w:hAnsi="Times New Roman"/>
+          <w:sz w:val="24"/>
+        </w:rPr>
+        <w:t>2</w:t>
+      </w:r>
+    </w:fldSimple>
   </w:p>
 </w:ftr>
 </file>

</xml_diff>

<commit_message>
Clarify Russian terminology, navigation software and neural network roles
</commit_message>
<xml_diff>
--- a/research/drafts/chapter-1.docx
+++ b/research/drafts/chapter-1.docx
@@ -50,7 +50,7 @@
         <w:rPr>
           <w:b w:val="0"/>
         </w:rPr>
-        <w:t xml:space="preserve">Международная морская организация (ММО) определяет автономное надводное судно — Maritime Autonomous Surface Ship (MASS) — как судно, способное в различной степени действовать независимо от взаимодействия с человеком. Это определение не устанавливает обязательного отсутствия экипажа. В Кодексе отдельно предусмотрено применение автономных и дистанционно управляемых функций при наличии людей на борту, выполняющих другие задачи [1, с. 8–9]. Поэтому в рамках исследования необходимо устанавливать, какие именно функции переданы технической системе или оператору за пределами судна, а также кто контролирует их выполнение.</w:t>
+        <w:t xml:space="preserve">Международная морская организация (ИМО) определяет автономное надводное судно — Maritime Autonomous Surface Ship (MASS) — как судно, способное в различной степени действовать независимо от взаимодействия с человеком. Это определение не устанавливает обязательного отсутствия экипажа. В Кодексе отдельно предусмотрено применение автономных и дистанционно управляемых функций при наличии людей на борту, выполняющих другие задачи [1, с. 8–9]. Поэтому в рамках исследования необходимо устанавливать, какие именно функции переданы технической системе или оператору за пределами судна, а также кто контролирует их выполнение.</w:t>
       </w:r>
     </w:p>
     <w:p>
@@ -61,7 +61,7 @@
         <w:rPr>
           <w:b w:val="0"/>
         </w:rPr>
-        <w:t xml:space="preserve">В мае 2026 года ММО приняла Кодекс безопасности MASS резолюцией MSC.595(111); начало его применения предусмотрено с 1 июля 2026 года [1, с. 1; 3]. Кодекс имеет необязательный статус и дополняет применимые международные инструменты. Согласно разделу об области применения, он относится к грузовым судам, на которые распространяется глава I Международной конвенции по охране человеческой жизни на море 1974 года, и связанным с ними центрам дистанционного управления при указанных в Кодексе условиях. Его положения нельзя автоматически представлять как универсальные обязательные правила для любого автономного плавсредства [1, с. 7–8].</w:t>
+        <w:t xml:space="preserve">В мае 2026 года ИМО приняла Кодекс безопасности MASS резолюцией MSC.595(111); начало его применения предусмотрено с 1 июля 2026 года [1, с. 1; 3]. Кодекс имеет необязательный статус и дополняет применимые международные инструменты. Согласно разделу об области применения, он относится к грузовым судам, на которые распространяется глава I Международной конвенции по охране человеческой жизни на море 1974 года, и связанным с ними центрам дистанционного управления при указанных в Кодексе условиях. Его положения нельзя автоматически представлять как универсальные обязательные правила для любого автономного плавсредства [1, с. 7–8].</w:t>
       </w:r>
     </w:p>
     <w:p>
@@ -83,7 +83,7 @@
         <w:rPr>
           <w:b w:val="0"/>
         </w:rPr>
-        <w:t xml:space="preserve">Для понимания развития терминологии необходимо учитывать классификацию, использованную ММО при исследовании применимости существующей нормативной базы к MASS. Итоги этого исследования опубликованы в циркуляре MSC.1/Circ.1638 от 3 июня 2021 года. В нём выделены четыре степени автономности, приведённые в таблице 1.1. Эта классификация описывает подход, применённый для нормативного исследования, и должна читаться с учётом его назначения [2, п. 3.3–3.5].</w:t>
+        <w:t xml:space="preserve">Для понимания развития терминологии необходимо учитывать классификацию, использованную ИМО при исследовании применимости существующей нормативной базы к MASS. Итоги этого исследования опубликованы в циркуляре MSC.1/Circ.1638 от 3 июня 2021 года. В нём выделены четыре степени автономности, приведённые в таблице 1.1. Эта классификация описывает подход, применённый для нормативного исследования, и должна читаться с учётом его назначения [2, п. 3.3–3.5].</w:t>
       </w:r>
     </w:p>
     <w:p>
@@ -99,7 +99,7 @@
           <w:b w:val="0"/>
           <w:sz w:val="24"/>
         </w:rPr>
-        <w:t xml:space="preserve">Таблица 1.1 — Степени автономности в нормативном исследовании ММО 2021 года</w:t>
+        <w:t xml:space="preserve">Таблица 1.1 — Степени автономности в нормативном исследовании ИМО 2021 года</w:t>
       </w:r>
     </w:p>
     <w:tbl>
@@ -535,7 +535,7 @@
         <w:rPr>
           <w:b w:val="0"/>
         </w:rPr>
-        <w:t xml:space="preserve">В настоящей работе узкостью называется участок плавания, на котором доступное для судна пространство ограничивает выбор пути и манёвра. Это рабочее определение задаёт предмет технического анализа: система должна вести судно в допустимых границах и учитывать, какое пространство остаётся для расхождения, поворота или изменения скорости. При оценке участка ширину водной поверхности необходимо сопоставлять с глубинами, осадкой, размерами и маневренными характеристиками судна. Руководство ММО по планированию рейса предусматривает учёт этих характеристик, минимального запаса воды под килем, просадки, крена на повороте и течений [5, п. 2.1, 3.2.2.1–3.2.2.5].</w:t>
+        <w:t xml:space="preserve">В настоящей работе узкостью называется участок плавания, на котором доступное для судна пространство ограничивает выбор пути и манёвра. Это рабочее определение задаёт предмет технического анализа: система должна вести судно в допустимых границах и учитывать, какое пространство остаётся для расхождения, поворота или изменения скорости. При оценке участка ширину водной поверхности необходимо сопоставлять с глубинами, осадкой, размерами и маневренными характеристиками судна. Руководство ИМО по планированию рейса предусматривает учёт этих характеристик, минимального запаса воды под килем, просадки, крена на повороте и течений [5, п. 2.1, 3.2.2.1–3.2.2.5].</w:t>
       </w:r>
     </w:p>
     <w:p>
@@ -627,6 +627,17 @@
         <w:rPr>
           <w:b w:val="0"/>
         </w:rPr>
+        <w:t xml:space="preserve">В составе комплекса необходимо различать прибор, программный модуль и алгоритм. Прибор получает физическое измерение: например, гирокомпас определяет курс. Программный модуль принимает данные, проверяет их и решает выделенную задачу, например оценивает движение цели. Алгоритм задаёт способ расчёта внутри этого модуля. Нейронная сеть является одним из возможных вычислительных методов, а не названием всей системы автономного судовождения. В архитектурном обзоре отдельно рассматриваются средства наблюдения, обработка информации, предотвращение столкновений и управление движением; для этих задач приведены разные методы [19, разд. 3.1, 3.6–3.7].</w:t>
+      </w:r>
+    </w:p>
+    <w:p>
+      <w:pPr>
+        <w:pStyle w:val="BodyText"/>
+      </w:pPr>
+      <w:r>
+        <w:rPr>
+          <w:b w:val="0"/>
+        </w:rPr>
         <w:t xml:space="preserve">Первый набор данных описывает собственное судно. Приёмник глобальной навигационной спутниковой системы (ГНСС) предоставляет навигационное решение о его положении и движении; гирокомпас — курс; лаг — скорость в соответствии с используемым принципом измерения; датчик угловой скорости — быстроту поворота. Эхолот даёт сведения о глубине под преобразователем, а датчики рулевой и энергетической установок показывают фактическое положение органов управления и состояние механизмов. В техническом составе, рассмотренном в учебном курсе, дополнительно предусмотрены инерциальная навигация, средства измерения ветра, качки и видимости [12, с. 3–4]. Для расчёта манёвра эти величины имеют разное назначение: координаты показывают, где находится судно, курс — куда направлена его диаметральная плоскость, скорость и угловая скорость — как оно движется в данный момент.</w:t>
       </w:r>
     </w:p>
@@ -638,7 +649,29 @@
         <w:rPr>
           <w:b w:val="0"/>
         </w:rPr>
-        <w:t xml:space="preserve">Второй набор данных относится к окружающим объектам. Радиолокационная станция (РЛС) и средства сопровождения целей дают наблюдения об обнаруженных объектах и их движении. Автоматическая идентификационная система (АИС) служит источником передаваемых участниками данных; её сообщения необходимо сопоставлять с другими наблюдениями. Оптические средства анализируют изображения видимого и инфракрасного диапазонов. В отдельных комплектациях предусматриваются лазерные дальномеры, лидары и средства приёма внешних звуковых сигналов [12, с. 3–4; 13, с. 39]. Различные каналы позволяют исследовать один объект с разных сторон: получить его положение относительно судна, признаки внешнего вида и доступные идентификационные сведения. Наличие одного канала не подтверждает полноту наблюдения всей акватории.</w:t>
+        <w:t xml:space="preserve">Второй набор данных относится к окружающим объектам. Радиолокационная станция (РЛС) обнаруживает отражающие объекты и определяет их положение относительно судна. Средства автоматической радиолокационной прокладки (САРП) обрабатывают последовательные радиолокационные наблюдения для сопровождения целей и оценки их движения. Автоматическая идентификационная система (АИС) служит источником передаваемых участниками данных; её сообщения необходимо сопоставлять с другими наблюдениями. Оптические средства анализируют изображения видимого и инфракрасного диапазонов. В отдельных комплектациях предусматриваются лазерные дальномеры, лидары и средства приёма внешних звуковых сигналов [12, с. 3–4; 13, с. 39]. Различные каналы позволяют исследовать один объект с разных сторон: получить его положение относительно судна, признаки внешнего вида и доступные идентификационные сведения. Наличие одного канала не подтверждает полноту наблюдения всей акватории.</w:t>
+      </w:r>
+    </w:p>
+    <w:p>
+      <w:pPr>
+        <w:pStyle w:val="BodyText"/>
+      </w:pPr>
+      <w:r>
+        <w:rPr>
+          <w:b w:val="0"/>
+        </w:rPr>
+        <w:t xml:space="preserve">Картографическая информация поступает из другого источника. Электронная картографическая навигационно-информационная система (ЭКНИС; англ. ECDIS) обеспечивает работу с электронной навигационной картой и навигационными данными; для автономного планирования нужны доступные программе сведения о береговых границах, глубинах и ограничениях района [13, с. 19; 19, разд. 3.3.1, 3.6.1–3.6.2]. Камера не определяет безопасную глубину по изображению воды, а текущий отсчёт эхолота не описывает глубины на всём будущем пути. Поэтому сведения о целях должны сопоставляться с картографическими ограничениями. Наличие изображения карты на экране само по себе ещё не показывает, какие данные получает модуль автоматического планирования.</w:t>
+      </w:r>
+    </w:p>
+    <w:p>
+      <w:pPr>
+        <w:pStyle w:val="BodyText"/>
+      </w:pPr>
+      <w:r>
+        <w:rPr>
+          <w:b w:val="0"/>
+        </w:rPr>
+        <w:t xml:space="preserve">Программное обеспечение связывает перечисленные источники. Входные модули принимают измерения и сообщения, средства контроля выявляют недоступность или несогласованность данных, модули обработки формируют описание обстановки, а планировщик передаёт задание системе управления. Эти функции могут быть распределены между устройствами и вычислителями; функциональная схема не означает, что все они выполняются одной программой на одном компьютере [11, с. 11–13; 19, разд. 3.1]. Для конкретного проекта необходимо различать название продукта, его программные модули и состав фактически установленного оборудования.</w:t>
       </w:r>
     </w:p>
     <w:p>
@@ -660,6 +693,28 @@
         <w:rPr>
           <w:b w:val="0"/>
         </w:rPr>
+        <w:t xml:space="preserve">Пример применения нейросети — распознавание объектов на изображении. В обзоре рассматриваются свёрточные нейронные сети, которые обрабатывают изображения и используются для распознавания и классификации морских объектов [19, разд. 3.6.1]. При машинном обучении модель настраивается по обучающим данным, а при эксплуатации применяет полученные параметры к новым наблюдениям. В рассматриваемом учебном описании поиск объектов использует загруженные образы и данные, сформированные в результате машинного обучения [13, с. 39–40]. Из этого описания не следует, что система непрерывно переобучается во время рейса.</w:t>
+      </w:r>
+    </w:p>
+    <w:p>
+      <w:pPr>
+        <w:pStyle w:val="BodyText"/>
+      </w:pPr>
+      <w:r>
+        <w:rPr>
+          <w:b w:val="0"/>
+        </w:rPr>
+        <w:t xml:space="preserve">Результат распознавания имеет ограниченное назначение: обнаруженный участок изображения, признаки или предполагаемый тип объекта ещё не являются командой рулевой машине. Далее нужны сопровождение цели, оценка её положения и движения, проверка риска и допустимости манёвра. Ошибка распознавания способна перейти на следующий уровень, поэтому наличие нейросети не устраняет необходимость проверять качество наблюдения и условия применения. Точное семейство сети, её версия, обучающие данные и ошибки конкретного комплекса в использованных описаниях не раскрыты; приписывать ему определённую модель без документации нельзя [13, с. 39–40; 19, разд. 3.6.1].</w:t>
+      </w:r>
+    </w:p>
+    <w:p>
+      <w:pPr>
+        <w:pStyle w:val="BodyText"/>
+      </w:pPr>
+      <w:r>
+        <w:rPr>
+          <w:b w:val="0"/>
+        </w:rPr>
         <w:t xml:space="preserve">Согласование наблюдений требуется потому, что одна цель может присутствовать сразу в нескольких источниках. Если объект обнаружен камерой и РЛС и одновременно передаёт данные АИС, вычислительная система должна установить, относятся ли эти записи к одному судну. В учебном описании предусмотрено сопоставление информации оптической подсистемы, АИС и РЛС [13, с. 40]. Для анализа такой функции существенны система координат, момент наблюдения и погрешность: сравнивать необработанные числа без их приведения к сопоставимому виду недостаточно. Например, после изменения движения цели прежнее сообщение и новое измерение могут расходиться без отказа датчика. Это объясняет, почему в исследовании наряду с координатами необходимо учитывать возраст данных и качество сопровождения. Конкретный алгоритм объединения наблюдений и его параметры должны устанавливаться по документации рассматриваемого комплекса.</w:t>
       </w:r>
     </w:p>
@@ -693,7 +748,29 @@
         <w:rPr>
           <w:b w:val="0"/>
         </w:rPr>
-        <w:t xml:space="preserve">Построитель движения формирует последовательность допустимых положений судна и изменения скорости. Исходный маршрут задаёт общий путь, а локальный манёвр уточняет его с учётом текущей обстановки. При проверке варианта должны учитываться другие суда, неподвижные опасности и возможность его исполнения. Кодекс MASS требует, чтобы действия по предотвращению столкновения, навала или посадки на мель не создавали иной ситуации с неприемлемым риском [1, с. 39–40]. Поэтому результат работы этого модуля нельзя описывать только командой «повернуть вправо». Требуется определить, где начинается поворот, как изменяется движение, остаётся ли судно в допустимом пространстве и как оно продолжает переход после расхождения.</w:t>
+        <w:t xml:space="preserve">В учебном материале этот этап представлен конкретным программным модулем Collision Avoidance System (CAS), включённым в программное обеспечение автономной навигационной системы (АНС) и подсистему автоматического маневрирования и расхождения. На вход подаются координаты, путевые углы и скорости целей, состояние своего судна, навигационные опасности и настройки расхождения. При обнаружении опасной цели или нарушения ограничений модуль строит варианты манёвра; судоводитель может просматривать предложенное расхождение на экране [14, с. 55–56]. CAS в данном источнике — название модуля конкретного описания. Оно не доказывает одинаковую реализацию всех систем предотвращения столкновений и не устанавливает используемую нейросетевую архитектуру.</w:t>
+      </w:r>
+    </w:p>
+    <w:p>
+      <w:pPr>
+        <w:pStyle w:val="BodyText"/>
+      </w:pPr>
+      <w:r>
+        <w:rPr>
+          <w:b w:val="0"/>
+        </w:rPr>
+        <w:t xml:space="preserve">Модуль планирования движения формирует последовательность допустимых положений судна и изменения скорости. Исходный маршрут задаёт общий путь, а локальный манёвр уточняет его с учётом текущей обстановки. При проверке варианта должны учитываться другие суда, неподвижные опасности и возможность его исполнения. Кодекс MASS требует, чтобы действия по предотвращению столкновения, навала или посадки на мель не создавали иной ситуации с неприемлемым риском [1, с. 39–40]. Поэтому результат работы этого модуля нельзя описывать только командой «повернуть вправо». Требуется определить, где начинается поворот, как изменяется движение, остаётся ли судно в допустимом пространстве и как оно продолжает переход после расхождения.</w:t>
+      </w:r>
+    </w:p>
+    <w:p>
+      <w:pPr>
+        <w:pStyle w:val="BodyText"/>
+      </w:pPr>
+      <w:r>
+        <w:rPr>
+          <w:b w:val="0"/>
+        </w:rPr>
+        <w:t xml:space="preserve">Для поиска пути могут использоваться алгоритмы, которые не относятся к нейронным сетям. В обзоре среди методов планирования названы поиск A* и его варианты; в описании представления среды упоминается алгоритм Дейкстры [19, разд. 3.6.1–3.6.2]. Такие методы ищут путь между допустимыми положениями по заданному правилу оценки переходов. Чтобы применить результат к судну, в постановке задачи необходимо учесть запретные области и выполнимость движения. Название алгоритма само по себе не подтверждает, что найденный путь соответствует маневренным характеристикам судна и всем применимым требованиям МППСС-72. В этой работе перечисленные методы рассматриваются как варианты реализации, а не как подтверждённое оснащение российских паромов.</w:t>
       </w:r>
     </w:p>
     <w:p>
@@ -726,7 +803,62 @@
         <w:rPr>
           <w:b w:val="0"/>
         </w:rPr>
+        <w:t xml:space="preserve">Работу программного регулятора можно проследить в открытом проекте Python Vehicle Simulator Т. И. Фоссена. Это средство моделирования судов и других морских аппаратов, дополняющее набор MATLAB Marine Systems Simulator. В исследованной версии класс frigate содержит метод headingAutopilot: он получает текущие курс и угловую скорость рыскания, вычисляет их отклонения от заданного движения и вызывает функцию PIDpolePlacement из файла control.py. Результатом является команда угла перекладки руля [21, README; frigate.py, headingAutopilot; control.py, PIDpolePlacement].</w:t>
+      </w:r>
+    </w:p>
+    <w:p>
+      <w:pPr>
+        <w:pStyle w:val="BodyText"/>
+      </w:pPr>
+      <w:r>
+        <w:rPr>
+          <w:b w:val="0"/>
+        </w:rPr>
+        <w:t xml:space="preserve">Пропорционально-интегрально-дифференциальный регулятор (ПИД-регулятор) в этом примере использует текущую ошибку, накопленную ошибку и отклонение скорости изменения управляемой величины. Эти составляющие позволяют реагировать на отклонение, учитывать его сохранение во времени и характер изменения движения. Вычисление выполняется по заданным формулам и коэффициентам; нейронная сеть в рассмотренной функции не используется [21, control.py, PIDpolePlacement]. Этот пример показывает именно способ исполнения задания курса. Он не является установленной на рассматриваемых судах программой и не заменяет обнаружение целей, выбор безопасного пути или одобрение системы для эксплуатации.</w:t>
+      </w:r>
+    </w:p>
+    <w:p>
+      <w:pPr>
+        <w:pStyle w:val="BodyText"/>
+      </w:pPr>
+      <w:r>
+        <w:rPr>
+          <w:b w:val="0"/>
+        </w:rPr>
         <w:t xml:space="preserve">Разделение уровней объясняет отличие авторулевого от автономного судовождения. Удержание заданного курса является задачей исполнения. Выбор самого курса с учётом встречного судна, глубин и применимых требований относится к более высоким уровням. Система может точно вести судно по заданной линии, но для безопасного автономного прохода дополнительно требуются обнаружение объектов, оценка ситуации и изменение плана движения. В таблице 1.2 приведена функциональная схема, составленная по рассмотренным источникам; она не задаёт обязательную комплектацию любого автономного судна.</w:t>
+      </w:r>
+    </w:p>
+    <w:p>
+      <w:pPr>
+        <w:pStyle w:val="BodyText"/>
+      </w:pPr>
+      <w:r>
+        <w:rPr>
+          <w:b w:val="0"/>
+        </w:rPr>
+        <w:t xml:space="preserve">Нормативные требования определяют, какие условия должны обеспечивать эти функции. Правило 5 МППСС-72 требует надлежащего наблюдения всеми подходящими средствами; правило 6 связывает безопасную скорость с видимостью, плотностью движения, маневренностью и другими обстоятельствами; правило 7 относится к оценке опасности столкновения; правило 8 — к своевременности, характеру и проверке результата действия; правило 9 устанавливает требования для узких проходов и фарватеров [18, международные правила 5–9]. Поэтому система не может ограничиться правилом вида «обнаружено судно — повернуть вправо». Она должна учитывать применимую ситуацию, доступное пространство, другие опасности и последствия своего действия.</w:t>
+      </w:r>
+    </w:p>
+    <w:p>
+      <w:pPr>
+        <w:pStyle w:val="BodyText"/>
+      </w:pPr>
+      <w:r>
+        <w:rPr>
+          <w:b w:val="0"/>
+        </w:rPr>
+        <w:t xml:space="preserve">Перевод правового требования в программную проверку является инженерной задачей. Например, требование безопасной скорости требует оценки условий и возможностей судна, а требование проверить эффективность манёвра — повторного наблюдения после выдачи команды. Эти связи представляют функциональный разбор требований, а не доказательство соответствия конкретной программы МППСС-72. Сам текст правил не предписывает нейросеть или определённый язык программирования. Для автономных функций Кодекс MASS дополнительно рассматривает эксплуатационные границы, резервные действия, взаимодействие с человеком и проверку технических систем [1, с. 20–24, 39–42].</w:t>
+      </w:r>
+    </w:p>
+    <w:p>
+      <w:pPr>
+        <w:pStyle w:val="BodyText"/>
+      </w:pPr>
+      <w:r>
+        <w:rPr>
+          <w:b w:val="0"/>
+        </w:rPr>
+        <w:t xml:space="preserve">Последовательность удобно показать на условном примере, который не является описанием проведённого испытания. При следовании по узкости средства наблюдения обнаружили малое судно, от которого не поступает сообщение АИС. Радиолокационные и оптические наблюдения передаются на обработку; программа связывает последовательные обнаружения и оценивает движение цели. Модуль оценки опасности сопоставляет прогноз с собственным путём. Затем планировщик проверяет возможные изменения движения с учётом правил, границ безопасных глубин и динамики судна. Допустимое задание передаётся системе управления маршрутом и авторулевому, которые формируют команды исполнительным механизмам. Новые измерения показывают, выполняется ли манёвр и уменьшается ли опасность. При недостатке данных или выходе за предусмотренные условия требуется установленная процедура резервного управления, а не предположение о том, что нейросеть сама найдёт безопасный выход [1, с. 21–24, 39–40; 14, с. 55–59].</w:t>
       </w:r>
     </w:p>
     <w:p>
@@ -1303,7 +1435,7 @@
         <w:rPr>
           <w:b w:val="0"/>
         </w:rPr>
-        <w:t xml:space="preserve">Исходной задачей является определение пространства, в котором судно может двигаться безопасно. При этом одной ширины прохода недостаточно. Руководство ММО по планированию рейса предусматривает учёт допустимой осадки, маневренных характеристик судна, глубин, опасных участков и актуальной навигационной информации. План должен охватывать переход от причала до причала, включая участки лоцманской проводки [5, п. 2.1, 3.1]. Для анализа MASS это означает необходимость связывать геометрию маршрута с характеристиками определённого судна и условиями конкретного перехода.</w:t>
+        <w:t xml:space="preserve">Исходной задачей является определение пространства, в котором судно может двигаться безопасно. При этом одной ширины прохода недостаточно. Руководство ИМО по планированию рейса предусматривает учёт допустимой осадки, маневренных характеристик судна, глубин, опасных участков и актуальной навигационной информации. План должен охватывать переход от причала до причала, включая участки лоцманской проводки [5, п. 2.1, 3.1]. Для анализа MASS это означает необходимость связывать геометрию маршрута с характеристиками определённого судна и условиями конкретного перехода.</w:t>
       </w:r>
     </w:p>
     <w:p>
@@ -1358,7 +1490,7 @@
         <w:rPr>
           <w:b w:val="0"/>
         </w:rPr>
-        <w:t xml:space="preserve">Взаимодействие с берегом и другими участниками следует включать в анализ наряду с работой бортовой системы. Руководство ММО предусматривает использование сведений о системах управления движением судов, лоцманской проводке, обмене информацией между капитаном и лоцманом и береговых возможностях реагирования на аварийные ситуации [5, п. 2.1.7.5–2.1.7.8]. В дальнейшем необходимо установить, какие сообщения должна получать рассматриваемая система, кто подтверждает их понимание и кто принимает решение при изменении согласованного порядка движения. Наличие канала связи ещё не описывает содержание такого взаимодействия.</w:t>
+        <w:t xml:space="preserve">Взаимодействие с берегом и другими участниками следует включать в анализ наряду с работой бортовой системы. Руководство ИМО предусматривает использование сведений о системах управления движением судов, лоцманской проводке, обмене информацией между капитаном и лоцманом и береговых возможностях реагирования на аварийные ситуации [5, п. 2.1.7.5–2.1.7.8]. В дальнейшем необходимо установить, какие сообщения должна получать рассматриваемая система, кто подтверждает их понимание и кто принимает решение при изменении согласованного порядка движения. Наличие канала связи ещё не описывает содержание такого взаимодействия.</w:t>
       </w:r>
     </w:p>
     <w:p>
@@ -1417,7 +1549,7 @@
         <w:rPr>
           <w:b w:val="0"/>
         </w:rPr>
-        <w:t xml:space="preserve">В официальном обзоре ММО правило 5 связано с надлежащим наблюдением всеми подходящими средствами, правило 6 — с безопасной скоростью, правило 7 — с оценкой риска столкновения по достаточной информации, правило 8 — с действиями для его предотвращения. Правило 9 относится к движению в узком проходе или фарватере [4]. Для технического анализа эти положения задают разные вопросы: как система получает сведения, как оценивает их достаточность, как выбирает скорость и как обосновывает действие. Полную проверку конкретного манёвра необходимо проводить по применимому тексту правил и условиям ситуации; обзорная страница служит ориентиром, а не заменой такой проверки.</w:t>
+        <w:t xml:space="preserve">В официальном обзоре ИМО правило 5 связано с надлежащим наблюдением всеми подходящими средствами, правило 6 — с безопасной скоростью, правило 7 — с оценкой риска столкновения по достаточной информации, правило 8 — с действиями для его предотвращения. Правило 9 относится к движению в узком проходе или фарватере [4]. Для технического анализа эти положения задают разные вопросы: как система получает сведения, как оценивает их достаточность, как выбирает скорость и как обосновывает действие. Полную проверку конкретного манёвра необходимо проводить по применимому тексту правил и условиям ситуации; обзорная страница служит ориентиром, а не заменой такой проверки.</w:t>
       </w:r>
     </w:p>
     <w:p>
@@ -1439,7 +1571,7 @@
         <w:rPr>
           <w:b w:val="0"/>
         </w:rPr>
-        <w:t xml:space="preserve">Планирование рейса также не сводится к прокладке линии пути. Руководство ММО A.893(21) выделяет сбор и оценку информации, подробное планирование, исполнение и непрерывное наблюдение за выполнением. План включает критические глубины, ограничения судна, условия определения места и варианты действий при обстоятельствах, требующих его изменения [5, п. 1.3, 2.1, 3.2, 5.2]. Для автономной системы необходимо установить, какие сведения она использует из плана, как принимает его изменения и каким образом капитан участвует в их утверждении [1, с. 39–40].</w:t>
+        <w:t xml:space="preserve">Планирование рейса также не сводится к прокладке линии пути. Руководство ИМО A.893(21) выделяет сбор и оценку информации, подробное планирование, исполнение и непрерывное наблюдение за выполнением. План включает критические глубины, ограничения судна, условия определения места и варианты действий при обстоятельствах, требующих его изменения [5, п. 1.3, 2.1, 3.2, 5.2]. Для автономной системы необходимо установить, какие сведения она использует из плана, как принимает его изменения и каким образом капитан участвует в их утверждении [1, с. 39–40].</w:t>
       </w:r>
     </w:p>
     <w:p>
@@ -1488,7 +1620,7 @@
     </w:p>
     <w:bookmarkEnd w:id="24"/>
     <w:bookmarkEnd w:id="25"/>
-    <w:bookmarkStart w:id="39" w:name="список-использованных-источников"/>
+    <w:bookmarkStart w:id="41" w:name="список-использованных-источников"/>
     <w:p>
       <w:pPr>
         <w:pStyle w:val="Heading1"/>
@@ -1983,7 +2115,7 @@
         <w:rPr>
           <w:b w:val="0"/>
         </w:rPr>
-        <w:t xml:space="preserve">18 United States Coast Guard Navigation Center. Navigation Rules: Amalgamated [Электронный ресурс] : международные положения правил 3 и 9. — URL:</w:t>
+        <w:t xml:space="preserve">18 United States Coast Guard Navigation Center. Navigation Rules: Amalgamated [Электронный ресурс] : международные положения правил 3 и 5–9. — URL:</w:t>
       </w:r>
       <w:r>
         <w:rPr>
@@ -2049,7 +2181,81 @@
         <w:t xml:space="preserve">(дата обращения: 09.10.2026).</w:t>
       </w:r>
     </w:p>
-    <w:bookmarkEnd w:id="39"/>
+    <w:p>
+      <w:pPr>
+        <w:pStyle w:val="BodyText"/>
+      </w:pPr>
+      <w:r>
+        <w:rPr>
+          <w:b w:val="0"/>
+        </w:rPr>
+        <w:t xml:space="preserve">20 Международная морская организация. Введение в ИМО [Электронный ресурс]. — URL:</w:t>
+      </w:r>
+      <w:r>
+        <w:rPr>
+          <w:b w:val="0"/>
+        </w:rPr>
+        <w:t xml:space="preserve"> </w:t>
+      </w:r>
+      <w:hyperlink r:id="rId39">
+        <w:r>
+          <w:rPr>
+            <w:rStyle w:val="Hyperlink"/>
+          </w:rPr>
+          <w:t xml:space="preserve">https://www.imo.org/ru/About/Pages/Default.aspx</w:t>
+        </w:r>
+      </w:hyperlink>
+      <w:r>
+        <w:rPr>
+          <w:b w:val="0"/>
+        </w:rPr>
+        <w:t xml:space="preserve"> </w:t>
+      </w:r>
+      <w:r>
+        <w:rPr>
+          <w:b w:val="0"/>
+        </w:rPr>
+        <w:t xml:space="preserve">(дата обращения: 11.10.2026).</w:t>
+      </w:r>
+    </w:p>
+    <w:p>
+      <w:pPr>
+        <w:pStyle w:val="BodyText"/>
+      </w:pPr>
+      <w:r>
+        <w:rPr>
+          <w:b w:val="0"/>
+        </w:rPr>
+        <w:t xml:space="preserve">21 Fossen T. I. Python Vehicle Simulator : README и исходный код [Электронный ресурс]. — Версия a93d1938ba1f, 26.09.2026. — URL:</w:t>
+      </w:r>
+      <w:r>
+        <w:rPr>
+          <w:b w:val="0"/>
+        </w:rPr>
+        <w:t xml:space="preserve"> </w:t>
+      </w:r>
+      <w:hyperlink r:id="rId40">
+        <w:r>
+          <w:rPr>
+            <w:rStyle w:val="Hyperlink"/>
+          </w:rPr>
+          <w:t xml:space="preserve">https://github.com/cybergalactic/PythonVehicleSimulator/tree/a93d1938ba1f78f2580c24c73f003091b2f03cd0</w:t>
+        </w:r>
+      </w:hyperlink>
+      <w:r>
+        <w:rPr>
+          <w:b w:val="0"/>
+        </w:rPr>
+        <w:t xml:space="preserve"> </w:t>
+      </w:r>
+      <w:r>
+        <w:rPr>
+          <w:b w:val="0"/>
+        </w:rPr>
+        <w:t xml:space="preserve">(дата обращения: 11.10.2026).</w:t>
+      </w:r>
+    </w:p>
+    <w:bookmarkEnd w:id="41"/>
     <w:sectPr>
       <w:footerReference r:id="rId9" w:type="default"/>
       <w:pgSz w:h="16838" w:w="11906"/>

</xml_diff>

<commit_message>
Review thesis wording, navigation requirements and table placement
</commit_message>
<xml_diff>
--- a/research/drafts/chapter-1.docx
+++ b/research/drafts/chapter-1.docx
@@ -50,7 +50,7 @@
         <w:rPr>
           <w:b w:val="0"/>
         </w:rPr>
-        <w:t xml:space="preserve">Международная морская организация (ИМО) определяет автономное надводное судно — Maritime Autonomous Surface Ship (MASS) — как судно, способное в различной степени действовать независимо от взаимодействия с человеком. Это определение не устанавливает обязательного отсутствия экипажа. В Кодексе отдельно предусмотрено применение автономных и дистанционно управляемых функций при наличии людей на борту, выполняющих другие задачи [1, с. 8–9]. Поэтому в рамках исследования необходимо устанавливать, какие именно функции переданы технической системе или оператору за пределами судна, а также кто контролирует их выполнение.</w:t>
+        <w:t xml:space="preserve">Международная морская организация (ИМО) определяет автономное надводное судно (Maritime Autonomous Surface Ship, MASS) как судно, способное в различной степени действовать независимо от взаимодействия с человеком. Это определение не устанавливает обязательного отсутствия экипажа. В Кодексе отдельно предусмотрено применение автономных и дистанционно управляемых функций при наличии людей на борту, выполняющих другие задачи [1, с. 8–9]. Поэтому в рамках исследования необходимо устанавливать, какие именно функции переданы технической системе или оператору за пределами судна, а также кто контролирует их выполнение.</w:t>
       </w:r>
     </w:p>
     <w:p>
@@ -72,7 +72,7 @@
         <w:rPr>
           <w:b w:val="0"/>
         </w:rPr>
-        <w:t xml:space="preserve">Кодекс разграничивает повышенную автоматизацию обычного судна и использование автономных либо дистанционно управляемых функций, которые дополняют или заменяют работу экипажа. Автономность процесса или оборудования определяется способностью в заданных условиях выбирать управляющие действия без вмешательства человека; такие свойства должны быть предусмотрены проектом и проверены. Дистанционное управление означает выполнение управления функциями и системами из места за пределами судна [1, с. 6, 9–10]. Следовательно, при дистанционном судовождении решение может принимать береговой оператор, а при автономном выполнении функции — система. Наличие дистанционного канала управления само по себе не показывает, что система самостоятельно оценивает навигационную ситуацию.</w:t>
+        <w:t xml:space="preserve">Кодекс разграничивает повышенную автоматизацию обычного судна и использование автономных либо дистанционно управляемых функций, которые дополняют или заменяют работу экипажа. Автономность процесса или оборудования определяется способностью в заданных условиях выбирать управляющие действия без вмешательства человека; такие свойства должны быть предусмотрены проектом и проверены. Дистанционное управление означает выполнение управления функциями и системами из места за пределами судна [1, с. 6, 9–10]. Следовательно, при дистанционном судовождении решение может принимать береговой оператор, а при автономном выполнении функции решение формирует система. Наличие дистанционного канала управления само по себе не показывает, что система самостоятельно оценивает навигационную ситуацию.</w:t>
       </w:r>
     </w:p>
     <w:p>
@@ -99,7 +99,7 @@
           <w:b w:val="0"/>
           <w:sz w:val="24"/>
         </w:rPr>
-        <w:t xml:space="preserve">Таблица 1.1 — Степени автономности в нормативном исследовании ИМО 2021 года</w:t>
+        <w:t xml:space="preserve">Таблица 1.1 – Степени автономности в нормативном исследовании ИМО 2021 года</w:t>
       </w:r>
     </w:p>
     <w:tbl>
@@ -498,7 +498,7 @@
         <w:rPr>
           <w:b w:val="0"/>
         </w:rPr>
-        <w:t xml:space="preserve">Допустимость работы системы связана с её эксплуатационными границами. Кодекс различает эксплуатационные возможности и ограничения судна в целом — Operational Envelope — и проектную область работы отдельной системы или функции — Operational Design Domain. В первое описание входят, в частности, район плавания, условия движения, связь и ограничения среды. Для отдельных функций учитываются безопасные условия применения, возможные неисправности и степень взаимодействия с человеком [1, с. 10, 20–21]. Таким образом, характеристика «автономное судно» требует уточнения условий, в которых предусмотрено выполнение конкретной задачи.</w:t>
+        <w:t xml:space="preserve">Допустимость работы системы связана с её эксплуатационными границами. Кодекс различает эксплуатационные возможности и ограничения судна в целом (Operational Envelope) и предусмотренную проектом область условий работы отдельной системы или функции (Operational Design Domain). В первое описание входят, в частности, район плавания, условия движения, связь и ограничения среды. Для отдельных функций учитываются безопасные условия применения, возможные неисправности и степень взаимодействия с человеком [1, с. 10, 20–21]. Таким образом, характеристика «автономное судно» требует уточнения условий, в которых предусмотрено выполнение конкретной задачи.</w:t>
       </w:r>
     </w:p>
     <w:p>
@@ -568,7 +568,7 @@
         <w:rPr>
           <w:b w:val="0"/>
         </w:rPr>
-        <w:t xml:space="preserve">Отдельно следует различать экранирование цели препятствием и ограниченную видимость. При подходе к изгибу другое судно может быть закрыто берегом или сооружением; правило 9(f) предусматривает для таких участков особую осторожность и соответствующий звуковой сигнал. Ограниченная видимость определяется правилом 3(l) через такие условия, как туман, мгла, снегопад, сильный дождь и аналогичные причины [18, правила 3(l), 9(f), международная редакция]. Для автономной системы эти случаи задают разные условия наблюдения: в одном случае необходимо учитывать геометрически закрытый сектор, в другом — возможности средств наблюдения при ухудшении видимости.</w:t>
+        <w:t xml:space="preserve">Отдельно следует различать экранирование цели препятствием и ограниченную видимость. При подходе к изгибу другое судно может быть закрыто берегом или сооружением; правило 9(f) предусматривает для таких участков особую осторожность и соответствующий звуковой сигнал. Ограниченная видимость определяется правилом 3(l) через такие условия, как туман, дымка, снегопад, сильный ливень, песчаная буря и другие подобные причины [18, правила 3(l), 9(f), международная редакция]. Для автономной системы эти случаи задают разные условия наблюдения: в одном случае необходимо учитывать геометрически закрытый сектор, в другом следует оценивать возможности средств наблюдения при ухудшении видимости.</w:t>
       </w:r>
     </w:p>
     <w:p>
@@ -616,7 +616,7 @@
         <w:rPr>
           <w:b w:val="0"/>
         </w:rPr>
-        <w:t xml:space="preserve">Такое разделение согласуется с обзором архитектуры автономной навигации, опубликованным в 2025 году. Авторы связывают ситуационную осведомлённость и объединение данных датчиков с предотвращением столкновений, а принятые решения — с управлением движением и исполнительными механизмами [19, разд. 3.1, 3.4]. Обзор служит основанием для описания функциональных связей; фактическая точность и надёжность конкретного комплекса устанавливаются по его испытаниям.</w:t>
+        <w:t xml:space="preserve">Такое разделение согласуется с обзором архитектуры автономной навигации, опубликованным в 2025 году. Авторы связывают ситуационную осведомлённость и объединение данных датчиков с предотвращением столкновений, а принятые решения связывают с управлением движением и исполнительными механизмами [19, разд. 3.1, 3.4]. Обзор служит основанием для описания функциональных связей; фактическая точность и надёжность конкретного комплекса устанавливаются по его испытаниям.</w:t>
       </w:r>
     </w:p>
     <w:p>
@@ -638,7 +638,7 @@
         <w:rPr>
           <w:b w:val="0"/>
         </w:rPr>
-        <w:t xml:space="preserve">Первый набор данных описывает собственное судно. Приёмник глобальной навигационной спутниковой системы (ГНСС) предоставляет навигационное решение о его положении и движении; гирокомпас — курс; лаг — скорость в соответствии с используемым принципом измерения; датчик угловой скорости — быстроту поворота. Эхолот даёт сведения о глубине под преобразователем, а датчики рулевой и энергетической установок показывают фактическое положение органов управления и состояние механизмов. В техническом составе, рассмотренном в учебном курсе, дополнительно предусмотрены инерциальная навигация, средства измерения ветра, качки и видимости [12, с. 3–4]. Для расчёта манёвра эти величины имеют разное назначение: координаты показывают, где находится судно, курс — куда направлена его диаметральная плоскость, скорость и угловая скорость — как оно движется в данный момент.</w:t>
+        <w:t xml:space="preserve">Первый набор данных описывает собственное судно. Приёмник глобальной навигационной спутниковой системы (ГНСС) предоставляет навигационное решение о его положении и движении; гирокомпас измеряет курс; лаг определяет скорость в соответствии с используемым принципом измерения; датчик угловой скорости измеряет быстроту поворота. Эхолот даёт сведения о глубине под преобразователем, а датчики рулевой и энергетической установок показывают фактическое положение органов управления и состояние механизмов. В техническом составе, рассмотренном в учебном курсе, дополнительно предусмотрены инерциальная навигация, средства измерения ветра, качки и видимости [12, с. 3–4]. Для расчёта манёвра эти величины имеют разное назначение: координаты показывают положение судна, курс характеризует направление его диаметральной плоскости, а скорость и угловая скорость описывают поступательное движение и поворот.</w:t>
       </w:r>
     </w:p>
     <w:p>
@@ -682,7 +682,7 @@
         <w:rPr>
           <w:b w:val="0"/>
         </w:rPr>
-        <w:t xml:space="preserve">Работу оптической подсистемы можно проследить по конкретной последовательности обработки. В описанном учебном примере кадры нескольких камер собираются с общей временной привязкой, корректируются и объединяются в панорамное изображение. Затем программа выделяет объекты, определяет доступные признаки и связывает наблюдения на последовательных кадрах. Результатом становится формуляр цели: её идентификатор, тип и оценённые параметры. При достаточной продолжительности наблюдения определяются характеристики движения. На экран оператора передаётся изображение с обозначениями объектов, а в навигационную систему — формуляры в согласованном формате [13, с. 39–40]. Таким образом, видеопоток для человека и данные для расчёта манёвра являются разными выходами одной подсистемы.</w:t>
+        <w:t xml:space="preserve">Работу оптической подсистемы можно проследить по конкретной последовательности обработки. В описанном учебном примере кадры нескольких камер собираются с общей временной привязкой, корректируются и объединяются в панорамное изображение. Затем программа выделяет объекты, определяет доступные признаки и связывает наблюдения на последовательных кадрах. Результатом становится формуляр цели: её идентификатор, тип и оценённые параметры. При достаточной продолжительности наблюдения определяются характеристики движения. На экран оператора передаётся изображение с обозначениями объектов, а в навигационную систему поступают формуляры в согласованном формате [13, с. 39–40]. Таким образом, видеопоток для человека и данные для расчёта манёвра являются разными выходами одной подсистемы.</w:t>
       </w:r>
     </w:p>
     <w:p>
@@ -693,7 +693,7 @@
         <w:rPr>
           <w:b w:val="0"/>
         </w:rPr>
-        <w:t xml:space="preserve">Пример применения нейросети — распознавание объектов на изображении. В обзоре рассматриваются свёрточные нейронные сети, которые обрабатывают изображения и используются для распознавания и классификации морских объектов [19, разд. 3.6.1]. При машинном обучении модель настраивается по обучающим данным, а при эксплуатации применяет полученные параметры к новым наблюдениям. В рассматриваемом учебном описании поиск объектов использует загруженные образы и данные, сформированные в результате машинного обучения [13, с. 39–40]. Из этого описания не следует, что система непрерывно переобучается во время рейса.</w:t>
+        <w:t xml:space="preserve">Одним из применений нейросети является распознавание объектов на изображении. В обзоре рассматриваются свёрточные нейронные сети, которые обрабатывают изображения и используются для распознавания и классификации морских объектов [19, разд. 3.6.1]. При машинном обучении модель настраивается по обучающим данным, а при эксплуатации применяет полученные параметры к новым наблюдениям. В рассматриваемом учебном описании поиск объектов использует загруженные образы и данные, сформированные в результате машинного обучения [13, с. 39–40]. Из этого описания не следует, что система непрерывно переобучается во время рейса.</w:t>
       </w:r>
     </w:p>
     <w:p>
@@ -748,7 +748,7 @@
         <w:rPr>
           <w:b w:val="0"/>
         </w:rPr>
-        <w:t xml:space="preserve">В учебном материале этот этап представлен конкретным программным модулем Collision Avoidance System (CAS), включённым в программное обеспечение автономной навигационной системы (АНС) и подсистему автоматического маневрирования и расхождения. На вход подаются координаты, путевые углы и скорости целей, состояние своего судна, навигационные опасности и настройки расхождения. При обнаружении опасной цели или нарушения ограничений модуль строит варианты манёвра; судоводитель может просматривать предложенное расхождение на экране [14, с. 55–56]. CAS в данном источнике — название модуля конкретного описания. Оно не доказывает одинаковую реализацию всех систем предотвращения столкновений и не устанавливает используемую нейросетевую архитектуру.</w:t>
+        <w:t xml:space="preserve">В учебном материале этот этап представлен конкретным программным модулем Collision Avoidance System (CAS), включённым в программное обеспечение автономной навигационной системы (АНС) и подсистему автоматического маневрирования и расхождения. На вход подаются координаты, путевые углы и скорости целей, состояние своего судна, навигационные опасности и настройки расхождения. При обнаружении опасной цели или нарушения ограничений модуль строит варианты манёвра; судоводитель может просматривать предложенное расхождение на экране [14, с. 55–56]. Обозначение CAS в данном источнике относится к описанному программному модулю. Оно не доказывает одинаковую реализацию всех систем предотвращения столкновений и не устанавливает используемую нейросетевую архитектуру.</w:t>
       </w:r>
     </w:p>
     <w:p>
@@ -814,7 +814,7 @@
         <w:rPr>
           <w:b w:val="0"/>
         </w:rPr>
-        <w:t xml:space="preserve">Пропорционально-интегрально-дифференциальный регулятор (ПИД-регулятор) в этом примере использует текущую ошибку, накопленную ошибку и отклонение скорости изменения управляемой величины. Эти составляющие позволяют реагировать на отклонение, учитывать его сохранение во времени и характер изменения движения. Вычисление выполняется по заданным формулам и коэффициентам; нейронная сеть в рассмотренной функции не используется [21, control.py, PIDpolePlacement]. Этот пример показывает именно способ исполнения задания курса. Он не является установленной на рассматриваемых судах программой и не заменяет обнаружение целей, выбор безопасного пути или одобрение системы для эксплуатации.</w:t>
+        <w:t xml:space="preserve">Пропорционально-интегрально-дифференциальный регулятор (ПИД-регулятор) в этом примере использует текущую ошибку, накопленную ошибку и отклонение скорости изменения управляемой величины. Эти составляющие позволяют реагировать на отклонение, учитывать его сохранение во времени и характер изменения движения. Вычисление выполняется по заданным формулам и коэффициентам; нейронная сеть в рассмотренной функции не используется [21, control.py, PIDpolePlacement]. Этот пример показывает именно способ исполнения задания курса. Этот исходный код не подтверждает применение такого регулятора на рассматриваемых российских судах. Регулирование курса само по себе не обеспечивает обнаружение целей и выбор безопасного пути; пример кода также не подтверждает одобрение системы для эксплуатации.</w:t>
       </w:r>
     </w:p>
     <w:p>
@@ -825,7 +825,7 @@
         <w:rPr>
           <w:b w:val="0"/>
         </w:rPr>
-        <w:t xml:space="preserve">Разделение уровней объясняет отличие авторулевого от автономного судовождения. Удержание заданного курса является задачей исполнения. Выбор самого курса с учётом встречного судна, глубин и применимых требований относится к более высоким уровням. Система может точно вести судно по заданной линии, но для безопасного автономного прохода дополнительно требуются обнаружение объектов, оценка ситуации и изменение плана движения. В таблице 1.2 приведена функциональная схема, составленная по рассмотренным источникам; она не задаёт обязательную комплектацию любого автономного судна.</w:t>
+        <w:t xml:space="preserve">Разделение уровней объясняет отличие авторулевого от автономного судовождения. Удержание заданного курса является задачей исполнения. Выбор самого курса с учётом встречного судна, глубин и применимых требований относится к более высоким уровням. Система может точно вести судно по заданной линии, но для безопасного автономного прохода дополнительно требуются обнаружение объектов, оценка ситуации и изменение плана движения.</w:t>
       </w:r>
     </w:p>
     <w:p>
@@ -836,7 +836,7 @@
         <w:rPr>
           <w:b w:val="0"/>
         </w:rPr>
-        <w:t xml:space="preserve">Нормативные требования определяют, какие условия должны обеспечивать эти функции. Правило 5 МППСС-72 требует надлежащего наблюдения всеми подходящими средствами; правило 6 связывает безопасную скорость с видимостью, плотностью движения, маневренностью и другими обстоятельствами; правило 7 относится к оценке опасности столкновения; правило 8 — к своевременности, характеру и проверке результата действия; правило 9 устанавливает требования для узких проходов и фарватеров [18, международные правила 5–9]. Поэтому система не может ограничиться правилом вида «обнаружено судно — повернуть вправо». Она должна учитывать применимую ситуацию, доступное пространство, другие опасности и последствия своего действия.</w:t>
+        <w:t xml:space="preserve">Нормативные требования определяют, какие условия должны обеспечивать эти функции. Правило 5 МППСС-72 требует постоянного надлежащего визуального и слухового наблюдения, а также использования всех доступных средств, подходящих для существующих обстоятельств и условий; правило 6 связывает безопасную скорость с видимостью, плотностью движения, маневренностью и другими обстоятельствами; правило 7 относится к оценке опасности столкновения; правило 8 определяет требования к своевременности, характеру и проверке результата действия; правило 9 устанавливает требования для узких проходов и фарватеров [18, международные правила 5–9]. Поэтому система не может ограничиться правилом вида «если обнаружено судно, повернуть вправо». Она должна учитывать применимую ситуацию, доступное пространство, другие опасности и последствия своего действия.</w:t>
       </w:r>
     </w:p>
     <w:p>
@@ -847,7 +847,7 @@
         <w:rPr>
           <w:b w:val="0"/>
         </w:rPr>
-        <w:t xml:space="preserve">Перевод правового требования в программную проверку является инженерной задачей. Например, требование безопасной скорости требует оценки условий и возможностей судна, а требование проверить эффективность манёвра — повторного наблюдения после выдачи команды. Эти связи представляют функциональный разбор требований, а не доказательство соответствия конкретной программы МППСС-72. Сам текст правил не предписывает нейросеть или определённый язык программирования. Для автономных функций Кодекс MASS дополнительно рассматривает эксплуатационные границы, резервные действия, взаимодействие с человеком и проверку технических систем [1, с. 20–24, 39–42].</w:t>
+        <w:t xml:space="preserve">Перевод правового требования в программную проверку является инженерной задачей. Например, требование безопасной скорости требует оценки условий и возможностей судна, а проверка эффективности манёвра требует повторного наблюдения после выдачи команды. Эти связи представляют функциональный разбор требований, а не доказательство соответствия конкретной программы МППСС-72. Сам текст правил не предписывает нейросеть или определённый язык программирования. Для автономных функций Кодекс MASS дополнительно рассматривает эксплуатационные границы, резервные действия, взаимодействие с человеком и проверку технических систем [1, с. 20–24, 39–42].</w:t>
       </w:r>
     </w:p>
     <w:p>
@@ -864,6 +864,17 @@
     <w:p>
       <w:pPr>
         <w:pStyle w:val="BodyText"/>
+      </w:pPr>
+      <w:r>
+        <w:rPr>
+          <w:b w:val="0"/>
+        </w:rPr>
+        <w:t xml:space="preserve">В таблице 1.2 приведена функциональная схема, составленная по рассмотренным источникам; она не задаёт обязательную комплектацию любого автономного судна.</w:t>
+      </w:r>
+    </w:p>
+    <w:p>
+      <w:pPr>
+        <w:pStyle w:val="BodyText"/>
         <w:keepNext/>
         <w:ind w:firstLine="0"/>
         <w:jc w:val="left"/>
@@ -874,7 +885,7 @@
           <w:b w:val="0"/>
           <w:sz w:val="24"/>
         </w:rPr>
-        <w:t xml:space="preserve">Таблица 1.2 — Передача данных и команд в системе автономного судовождения</w:t>
+        <w:t xml:space="preserve">Таблица 1.2 – Передача данных и команд в системе автономного судовождения</w:t>
       </w:r>
     </w:p>
     <w:tbl>
@@ -1376,7 +1387,7 @@
         <w:rPr>
           <w:b w:val="0"/>
         </w:rPr>
-        <w:t xml:space="preserve">Связи между звеньями определяют, какую причину ошибки следует искать. Пропущенная цель относится к наблюдению; неверное сопоставление записей — к обработке данных; опасная траектория при правильно обнаруженной цели — к оценке и планированию; невыполненный поворот при правильном задании — к управлению или исполнению. Такое разделение позволяет проверять конкретную функцию, вместо того чтобы оценивать весь комплекс по общему обозначению «автономный» [1, с. 24, 39–40; 13, с. 39–40; 14, с. 55–59; 15, с. 5–6].</w:t>
+        <w:t xml:space="preserve">Связи между звеньями помогают определить направление проверки при нарушении работы. При пропуске цели проверяют средства наблюдения и обработку их данных; при неверном сопоставлении записей проверяют объединение наблюдений; при опасной траектории проверяют оценку обстановки и планирование; при невыполненном повороте проверяют управление и исполнительные механизмы. Это исходные направления диагностики: по одному внешнему признаку нельзя однозначно установить неисправное звено. Такое разделение позволяет проверять конкретную функцию, вместо того чтобы оценивать весь комплекс по общему обозначению «автономный» [1, с. 24, 39–40; 13, с. 39–40; 14, с. 55–59; 15, с. 5–6].</w:t>
       </w:r>
     </w:p>
     <w:p>
@@ -1468,7 +1479,7 @@
         <w:rPr>
           <w:b w:val="0"/>
         </w:rPr>
-        <w:t xml:space="preserve">Правило 9 связывает движение в узком проходе или фарватере с положением относительно правой внешней границы, насколько это безопасно и практически возможно. В нём также учитываются суда, способные безопасно двигаться только в пределах прохода, и ограничения для других участников, которые не должны препятствовать их движению [4]. Для автономной функции существенна способность определить не только направление движения, но и обстоятельства, от которых зависит применимое требование. Выбор правой стороны пути не заменяет проверки глубин, пространства для манёвра и взаимодействия с другими судами.</w:t>
+        <w:t xml:space="preserve">Правило 9 связывает движение в узком проходе или фарватере с положением относительно правой внешней границы, насколько это безопасно и практически возможно. В нём также учитываются суда, способные безопасно двигаться только в пределах прохода, и ограничения для других участников, которые не должны препятствовать их движению [18, международное правило 9(a)–(d)]. Для автономной функции существенна способность определить не только направление движения, но и обстоятельства, от которых зависит применимое требование. Выбор правой стороны пути не заменяет проверки глубин, пространства для манёвра и взаимодействия с другими судами.</w:t>
       </w:r>
     </w:p>
     <w:p>
@@ -1479,7 +1490,7 @@
         <w:rPr>
           <w:b w:val="0"/>
         </w:rPr>
-        <w:t xml:space="preserve">Гидрометеорологическая обстановка и видимость должны входить в описание сценария. В руководстве по планированию предусмотрен учёт течений, приливов, метеорологических условий, ночного прохождения опасных точек и надёжности определения места. При исполнении плана необходимо оценивать, не создают ли ожидаемые условия недопустимую опасность [5, п. 2.1.7, 4.2–4.3]. Для MASS эти сведения связаны с эксплуатационными границами судна и проектной областью работы отдельных функций. Кодекс предусматривает обнаружение выхода функции за такую область и заранее определённую реакцию судна при выходе за общие эксплуатационные границы [1, с. 20–21].</w:t>
+        <w:t xml:space="preserve">Гидрометеорологическая обстановка и видимость должны входить в описание сценария. В руководстве по планированию предусмотрен учёт течений, приливов, метеорологических условий, ночного прохождения опасных точек и надёжности определения места. При исполнении плана необходимо оценивать, не создают ли ожидаемые условия недопустимую опасность [5, п. 2.1.7, 4.2–4.3]. Для MASS эти сведения связаны с эксплуатационными границами судна и предусмотренной проектом областью условий работы отдельных функций. Кодекс предусматривает обнаружение выхода функции за такую область и заранее определённую реакцию судна при выходе за общие эксплуатационные границы [1, с. 20–21].</w:t>
       </w:r>
     </w:p>
     <w:p>
@@ -1549,7 +1560,7 @@
         <w:rPr>
           <w:b w:val="0"/>
         </w:rPr>
-        <w:t xml:space="preserve">В официальном обзоре ИМО правило 5 связано с надлежащим наблюдением всеми подходящими средствами, правило 6 — с безопасной скоростью, правило 7 — с оценкой риска столкновения по достаточной информации, правило 8 — с действиями для его предотвращения. Правило 9 относится к движению в узком проходе или фарватере [4]. Для технического анализа эти положения задают разные вопросы: как система получает сведения, как оценивает их достаточность, как выбирает скорость и как обосновывает действие. Полную проверку конкретного манёвра необходимо проводить по применимому тексту правил и условиям ситуации; обзорная страница служит ориентиром, а не заменой такой проверки.</w:t>
+        <w:t xml:space="preserve">В официальном обзоре ИМО перечислены требования к наблюдению, безопасной скорости, оценке опасности столкновения и действиям для его предотвращения [4]. В тексте международных правил правило 5 предусматривает постоянное визуальное и слуховое наблюдение с использованием всех доступных подходящих средств; правило 6 устанавливает требования к безопасной скорости; правило 7 определяет порядок оценки опасности столкновения; правило 8 относится к действиям для его предотвращения. Правило 9 регулирует движение в узком проходе или фарватере [18, международные правила 5–9]. Для технического анализа эти положения задают разные вопросы: как система получает сведения, как оценивает их достаточность, как выбирает скорость и как обосновывает действие. Полную проверку конкретного манёвра необходимо проводить по применимому тексту правил и условиям ситуации; обзорная страница служит ориентиром, а не заменой такой проверки.</w:t>
       </w:r>
     </w:p>
     <w:p>
@@ -1582,7 +1593,7 @@
         <w:rPr>
           <w:b w:val="0"/>
         </w:rPr>
-        <w:t xml:space="preserve">Вопрос человеческого контроля относится к нормативной оценке независимо от степени автоматизации. Кодекс предусматривает ответственное лицо — капитана — и возможность вмешательства. Средства принятия управления навигацией должны быть простыми в использовании, независимыми от контролируемых систем и позволять немедленно принять управление [1, с. 22, 41]. В сценариях узкостей эти положения необходимо рассматривать вместе с предоставлением человеку времени и информации для понимания ситуации. Техническая возможность переключения режима и готовность оператора продолжить управление представляют связанные, но разные условия.</w:t>
+        <w:t xml:space="preserve">Вопрос человеческого контроля относится к нормативной оценке независимо от степени автоматизации. Кодекс предусматривает ответственность капитана за MASS и возможность вмешательства в управление. Средства принятия управления навигацией должны быть простыми в использовании, независимыми от контролируемых систем и позволять немедленно принять управление [1, с. 22, 41]. В сценариях узкостей эти положения необходимо рассматривать вместе с предоставлением человеку времени и информации для понимания ситуации. Техническая возможность переключения режима и готовность оператора продолжить управление представляют связанные, но разные условия.</w:t>
       </w:r>
     </w:p>
     <w:p>
@@ -1593,7 +1604,7 @@
         <w:rPr>
           <w:b w:val="0"/>
         </w:rPr>
-        <w:t xml:space="preserve">Режим проведения испытания следует отличать от обычной эксплуатации. Временное руководство MSC.1/Circ.1604 от 14 июня 2019 года определяет испытание как ограниченный по времени эксперимент для оценки альтернативного выполнения функций или соблюдения требований. Оно предусматривает разрешение администрации государства флага, а при необходимости — прибрежного государства или портовых властей. Для испытаний рассматриваются оценка риска, аварийные меры, подготовка участников и условия остановки при выходе за параметры безопасности [6, п. 1.2.2–1.2.3, 2.1–2.3]. Этот документ объясняет требования к испытательному режиму; сам по себе он не подтверждает одобрение определённой системы или завершение её проверки.</w:t>
+        <w:t xml:space="preserve">Режим проведения испытания следует отличать от обычной эксплуатации. Временное руководство MSC.1/Circ.1604 от 14 июня 2019 года определяет испытание как ограниченный по времени эксперимент для оценки альтернативного выполнения функций или соблюдения требований. Оно предусматривает разрешение администрации государства флага, а при необходимости также прибрежного государства или портовых властей. Для испытаний рассматриваются оценка риска, аварийные меры, подготовка участников и условия остановки при выходе за параметры безопасности [6, п. 1.2.2–1.2.3, 2.1–2.3]. Этот документ объясняет требования к испытательному режиму; сам по себе он не подтверждает одобрение определённой системы или завершение её проверки.</w:t>
       </w:r>
     </w:p>
     <w:p>
@@ -1604,7 +1615,7 @@
         <w:rPr>
           <w:b w:val="0"/>
         </w:rPr>
-        <w:t xml:space="preserve">Для российских проектов необходимо отдельно устанавливать содержание выданных документов и разрешённых режимов. Показателен опубликованный разработчиком пример паромов «Маршал Рокоссовский» и «Генерал Черняховский». В сообщении Sitronics от 3 октября 2023 года дистанционное управление описано применительно к движению в море, а прохождение узкостей и вход в порт — как ручное управление с поддержкой принятия решений [7]. Это датированное сообщение о конкретном проекте; оно не устанавливает общую норму для российского флота и не подтверждает неизменность условий в 2026 году. Для правовой оценки проекта требуются документы Регистра, эксплуатанта и применимые национальные акты.</w:t>
+        <w:t xml:space="preserve">Для российских проектов необходимо отдельно устанавливать содержание выданных документов и разрешённых режимов. Показателен опубликованный разработчиком пример паромов «Маршал Рокоссовский» и «Генерал Черняховский». В сообщении Sitronics от 3 октября 2023 года дистанционное управление описано применительно к движению в море, а для прохождения узкостей и входа в порт указано ручное управление с поддержкой принятия решений [7]. Это датированное сообщение о конкретном проекте; оно не устанавливает общую норму для российского флота и не подтверждает неизменность условий в 2026 году. Для правовой оценки проекта требуются документы Регистра, эксплуатанта и применимые национальные акты.</w:t>
       </w:r>
     </w:p>
     <w:p>
@@ -1642,7 +1653,7 @@
         <w:rPr>
           <w:b w:val="0"/>
         </w:rPr>
-        <w:t xml:space="preserve">1 International Maritime Organization. International Code of Safety for Maritime Autonomous Surface Ships (MASS Code) : resolution MSC.595(111) // MSC 111/22. Annex 16. — 2026. — 87 p. — URL:</w:t>
+        <w:t xml:space="preserve">1 International Maritime Organization. International Code of Safety for Maritime Autonomous Surface Ships (MASS Code) : resolution MSC.595(111) // MSC 111/22. Annex 16. – 2026. – 87 p. – URL:</w:t>
       </w:r>
       <w:r>
         <w:rPr>
@@ -1679,7 +1690,7 @@
         <w:rPr>
           <w:b w:val="0"/>
         </w:rPr>
-        <w:t xml:space="preserve">2 International Maritime Organization. Outcome of the Regulatory Scoping Exercise for the Use of Maritime Autonomous Surface Ships (MASS) : MSC.1/Circ.1638, 3 June 2021. — 2021. — URL:</w:t>
+        <w:t xml:space="preserve">2 International Maritime Organization. Outcome of the Regulatory Scoping Exercise for the Use of Maritime Autonomous Surface Ships (MASS) : MSC.1/Circ.1638, 3 June 2021. – 2021. – URL:</w:t>
       </w:r>
       <w:r>
         <w:rPr>
@@ -1716,7 +1727,7 @@
         <w:rPr>
           <w:b w:val="0"/>
         </w:rPr>
-        <w:t xml:space="preserve">3 International Maritime Organization. FAQ — Autonomous shipping. — URL:</w:t>
+        <w:t xml:space="preserve">3 International Maritime Organization. FAQ – Autonomous shipping. – URL:</w:t>
       </w:r>
       <w:r>
         <w:rPr>
@@ -1753,7 +1764,7 @@
         <w:rPr>
           <w:b w:val="0"/>
         </w:rPr>
-        <w:t xml:space="preserve">4 International Maritime Organization. Convention on the International Regulations for Preventing Collisions at Sea, 1972 (COLREGs) : official overview. — URL:</w:t>
+        <w:t xml:space="preserve">4 International Maritime Organization. Convention on the International Regulations for Preventing Collisions at Sea, 1972 (COLREGs) : official overview. – URL:</w:t>
       </w:r>
       <w:r>
         <w:rPr>
@@ -1790,7 +1801,7 @@
         <w:rPr>
           <w:b w:val="0"/>
         </w:rPr>
-        <w:t xml:space="preserve">5 International Maritime Organization. Guidelines for Voyage Planning : resolution A.893(21), adopted on 25 November 1999. — URL:</w:t>
+        <w:t xml:space="preserve">5 International Maritime Organization. Guidelines for Voyage Planning : resolution A.893(21), adopted on 25 November 1999. – URL:</w:t>
       </w:r>
       <w:r>
         <w:rPr>
@@ -1827,7 +1838,7 @@
         <w:rPr>
           <w:b w:val="0"/>
         </w:rPr>
-        <w:t xml:space="preserve">6 International Maritime Organization. Interim Guidelines for MASS Trials : MSC.1/Circ.1604, 14 June 2019. — URL:</w:t>
+        <w:t xml:space="preserve">6 International Maritime Organization. Interim Guidelines for MASS Trials : MSC.1/Circ.1604, 14 June 2019. – URL:</w:t>
       </w:r>
       <w:r>
         <w:rPr>
@@ -1864,7 +1875,7 @@
         <w:rPr>
           <w:b w:val="0"/>
         </w:rPr>
-        <w:t xml:space="preserve">7 Sitronics Group. Паромы ФГУП «Росморпорт» получили первые в России удостоверения морских автономных и дистанционно управляемых надводных судов. — 03.10.2023. — URL:</w:t>
+        <w:t xml:space="preserve">7 Sitronics Group. Паромы ФГУП «Росморпорт» получили первые в России удостоверения морских автономных и дистанционно управляемых надводных судов. – 03.10.2023. – URL:</w:t>
       </w:r>
       <w:r>
         <w:rPr>
@@ -1901,7 +1912,7 @@
         <w:rPr>
           <w:b w:val="0"/>
         </w:rPr>
-        <w:t xml:space="preserve">8 Sitronics Group. Компания Sitronics KT продемонстрировала автономное судовождение в реальных условиях. — 11.05.2021. — URL:</w:t>
+        <w:t xml:space="preserve">8 Sitronics Group. Компания Sitronics KT продемонстрировала автономное судовождение в реальных условиях. – 11.05.2021. – URL:</w:t>
       </w:r>
       <w:r>
         <w:rPr>
@@ -1938,7 +1949,7 @@
         <w:rPr>
           <w:b w:val="0"/>
         </w:rPr>
-        <w:t xml:space="preserve">9 Sitronics Group. В России началась коммерческая эксплуатация первого морского судна в режиме дистанционного управления: паром «Генерал Черняховский» начал автономный рейс. — 19.12.2023. — URL:</w:t>
+        <w:t xml:space="preserve">9 Sitronics Group. В России началась коммерческая эксплуатация первого морского судна в режиме дистанционного управления: паром «Генерал Черняховский» начал автономный рейс. – 19.12.2023. – URL:</w:t>
       </w:r>
       <w:r>
         <w:rPr>
@@ -1975,7 +1986,7 @@
         <w:rPr>
           <w:b w:val="0"/>
         </w:rPr>
-        <w:t xml:space="preserve">10 Sitronics Group. Безэкипажный катер Sitronics KT доставил бюллетени для голосования и избирательную документацию на островные территории Архангельской области. — 15.09.2026. — URL:</w:t>
+        <w:t xml:space="preserve">10 Sitronics Group. Безэкипажный катер Sitronics KT доставил бюллетени для голосования и избирательную документацию на островные территории Архангельской области. – 15.09.2026. – URL:</w:t>
       </w:r>
       <w:r>
         <w:rPr>
@@ -2012,7 +2023,7 @@
         <w:rPr>
           <w:b w:val="0"/>
         </w:rPr>
-        <w:t xml:space="preserve">11 Раздел 2. Принципы организации структуры МАНС : учебный материал [Электронный ресурс] // СДО «Фарватер». — [Б. г.]. — 24 с.</w:t>
+        <w:t xml:space="preserve">11 Раздел 2. Принципы организации структуры МАНС : учебный материал [Электронный ресурс] // СДО «Фарватер». – [Б. г.]. – 24 с.</w:t>
       </w:r>
     </w:p>
     <w:p>
@@ -2023,7 +2034,7 @@
         <w:rPr>
           <w:b w:val="0"/>
         </w:rPr>
-        <w:t xml:space="preserve">12 Раздел 4. Технические средства судовождения МАНС : учебный материал [Электронный ресурс] // СДО «Фарватер». — [Б. г.]. — 25 с.</w:t>
+        <w:t xml:space="preserve">12 Раздел 4. Технические средства судовождения МАНС : учебный материал [Электронный ресурс] // СДО «Фарватер». – [Б. г.]. – 25 с.</w:t>
       </w:r>
     </w:p>
     <w:p>
@@ -2034,7 +2045,7 @@
         <w:rPr>
           <w:b w:val="0"/>
         </w:rPr>
-        <w:t xml:space="preserve">13 Раздел 5. Информационные потоки МАНС : учебный материал [Электронный ресурс] // СДО «Фарватер». — [Б. г.]. — 49 с.</w:t>
+        <w:t xml:space="preserve">13 Раздел 5. Информационные потоки МАНС : учебный материал [Электронный ресурс] // СДО «Фарватер». – [Б. г.]. – 49 с.</w:t>
       </w:r>
     </w:p>
     <w:p>
@@ -2045,7 +2056,7 @@
         <w:rPr>
           <w:b w:val="0"/>
         </w:rPr>
-        <w:t xml:space="preserve">14 Раздел 3. Математические основы средств автономности судна : учебный материал [Электронный ресурс] // СДО «Фарватер». — [Б. г.]. — 69 с.</w:t>
+        <w:t xml:space="preserve">14 Раздел 3. Математические основы средств автономности судна : учебный материал [Электронный ресурс] // СДО «Фарватер». – [Б. г.]. – 69 с.</w:t>
       </w:r>
     </w:p>
     <w:p>
@@ -2056,7 +2067,7 @@
         <w:rPr>
           <w:b w:val="0"/>
         </w:rPr>
-        <w:t xml:space="preserve">15 Раздел 8. Управление МАНС : учебный материал [Электронный ресурс] // СДО «Фарватер». — [Б. г.]. — 18 с.</w:t>
+        <w:t xml:space="preserve">15 Раздел 8. Управление МАНС : учебный материал [Электронный ресурс] // СДО «Фарватер». – [Б. г.]. – 18 с.</w:t>
       </w:r>
     </w:p>
     <w:p>
@@ -2067,7 +2078,7 @@
         <w:rPr>
           <w:b w:val="0"/>
         </w:rPr>
-        <w:t xml:space="preserve">16 Раздел 7. Кибербезопасность : учебный материал [Электронный ресурс] // СДО «Фарватер». — [Б. г.]. — 35 с.</w:t>
+        <w:t xml:space="preserve">16 Раздел 7. Кибербезопасность : учебный материал [Электронный ресурс] // СДО «Фарватер». – [Б. г.]. – 35 с.</w:t>
       </w:r>
     </w:p>
     <w:p>
@@ -2078,7 +2089,7 @@
         <w:rPr>
           <w:b w:val="0"/>
         </w:rPr>
-        <w:t xml:space="preserve">17 Fossen T. I. Fossen’s Marine Craft Model [Электронный ресурс]. — URL:</w:t>
+        <w:t xml:space="preserve">17 Fossen T. I. Fossen’s Marine Craft Model [Электронный ресурс]. – URL:</w:t>
       </w:r>
       <w:r>
         <w:rPr>
@@ -2115,7 +2126,7 @@
         <w:rPr>
           <w:b w:val="0"/>
         </w:rPr>
-        <w:t xml:space="preserve">18 United States Coast Guard Navigation Center. Navigation Rules: Amalgamated [Электронный ресурс] : международные положения правил 3 и 5–9. — URL:</w:t>
+        <w:t xml:space="preserve">18 United States Coast Guard Navigation Center. Navigation Rules: Amalgamated [Электронный ресурс] : международные положения правил 3 и 5–9. – URL:</w:t>
       </w:r>
       <w:r>
         <w:rPr>
@@ -2152,7 +2163,7 @@
         <w:rPr>
           <w:b w:val="0"/>
         </w:rPr>
-        <w:t xml:space="preserve">19 Alamoush A. S., Ölçer A. I. Maritime Autonomous Surface Ships: Architecture for Autonomous Navigation Systems // Journal of Marine Science and Engineering. — 2025. — Vol. 13, no. 1. — Art. 122. — DOI: 10.3390/jmse13010122. — URL:</w:t>
+        <w:t xml:space="preserve">19 Alamoush A. S., Ölçer A. I. Maritime Autonomous Surface Ships: Architecture for Autonomous Navigation Systems // Journal of Marine Science and Engineering. – 2025. – Vol. 13, no. 1. – Art. 122. – DOI: 10.3390/jmse13010122. – URL:</w:t>
       </w:r>
       <w:r>
         <w:rPr>
@@ -2189,7 +2200,7 @@
         <w:rPr>
           <w:b w:val="0"/>
         </w:rPr>
-        <w:t xml:space="preserve">20 Международная морская организация. Введение в ИМО [Электронный ресурс]. — URL:</w:t>
+        <w:t xml:space="preserve">20 Международная морская организация. Введение в ИМО [Электронный ресурс]. – URL:</w:t>
       </w:r>
       <w:r>
         <w:rPr>
@@ -2226,7 +2237,7 @@
         <w:rPr>
           <w:b w:val="0"/>
         </w:rPr>
-        <w:t xml:space="preserve">21 Fossen T. I. Python Vehicle Simulator : README и исходный код [Электронный ресурс]. — Версия a93d1938ba1f, 26.09.2026. — URL:</w:t>
+        <w:t xml:space="preserve">21 Fossen T. I. Python Vehicle Simulator : README и исходный код [Электронный ресурс]. – Версия a93d1938ba1f, 26.09.2026. – URL:</w:t>
       </w:r>
       <w:r>
         <w:rPr>

</xml_diff>